<commit_message>
Data Analysis 2 revisions
</commit_message>
<xml_diff>
--- a/data_analysis_2/data_analysis_2.docx
+++ b/data_analysis_2/data_analysis_2.docx
@@ -23,7 +23,7 @@
         <w:pStyle w:val="Date"/>
       </w:pPr>
       <w:r>
-        <w:t xml:space="preserve">2025-09-15</w:t>
+        <w:t xml:space="preserve">2026-09-16</w:t>
       </w:r>
     </w:p>
     <w:p>
@@ -31,12 +31,12 @@
         <w:pStyle w:val="FirstParagraph"/>
       </w:pPr>
       <w:r>
-        <w:t xml:space="preserve">Copyright Ryan Womack, 2025. This work is licensed under</w:t>
-      </w:r>
-      <w:r>
-        <w:t xml:space="preserve"> </w:t>
-      </w:r>
-      <w:hyperlink r:id="rId20">
+        <w:t xml:space="preserve">Copyright Ryan Womack, 2026. This work is licensed under</w:t>
+      </w:r>
+      <w:r>
+        <w:t xml:space="preserve"> </w:t>
+      </w:r>
+      <w:hyperlink r:id="rId9">
         <w:r>
           <w:rPr>
             <w:rStyle w:val="Hyperlink"/>
@@ -69,7 +69,7 @@
         <w:t xml:space="preserve">statistical tests, distributions, regression, bootstrap, and more + comparison with Python</w:t>
       </w:r>
     </w:p>
-    <w:bookmarkStart w:id="24" w:name="overview"/>
+    <w:bookmarkStart w:id="13" w:name="overview"/>
     <w:p>
       <w:pPr>
         <w:pStyle w:val="Heading1"/>
@@ -104,7 +104,7 @@
       <w:r>
         <w:t xml:space="preserve"> </w:t>
       </w:r>
-      <w:hyperlink r:id="rId21">
+      <w:hyperlink r:id="rId10">
         <w:r>
           <w:rPr>
             <w:rStyle w:val="Hyperlink"/>
@@ -121,7 +121,7 @@
       <w:r>
         <w:t xml:space="preserve"> </w:t>
       </w:r>
-      <w:hyperlink r:id="rId22">
+      <w:hyperlink r:id="rId11">
         <w:r>
           <w:rPr>
             <w:rStyle w:val="Hyperlink"/>
@@ -135,7 +135,7 @@
       <w:r>
         <w:t xml:space="preserve"> </w:t>
       </w:r>
-      <w:hyperlink r:id="rId23">
+      <w:hyperlink r:id="rId12">
         <w:r>
           <w:rPr>
             <w:rStyle w:val="Hyperlink"/>
@@ -182,8 +182,8 @@
         <w:t xml:space="preserve">in Python.</w:t>
       </w:r>
     </w:p>
-    <w:bookmarkEnd w:id="24"/>
-    <w:bookmarkStart w:id="34" w:name="setup-and-preparing-data"/>
+    <w:bookmarkEnd w:id="13"/>
+    <w:bookmarkStart w:id="23" w:name="setup-and-preparing-data"/>
     <w:p>
       <w:pPr>
         <w:pStyle w:val="Heading1"/>
@@ -192,7 +192,7 @@
         <w:t xml:space="preserve">2. Setup and preparing data</w:t>
       </w:r>
     </w:p>
-    <w:bookmarkStart w:id="27" w:name="r-packages-required"/>
+    <w:bookmarkStart w:id="16" w:name="r-packages-required"/>
     <w:p>
       <w:pPr>
         <w:pStyle w:val="Heading2"/>
@@ -211,7 +211,7 @@
       <w:r>
         <w:t xml:space="preserve"> </w:t>
       </w:r>
-      <w:hyperlink r:id="rId25">
+      <w:hyperlink r:id="rId14">
         <w:r>
           <w:rPr>
             <w:rStyle w:val="Hyperlink"/>
@@ -254,7 +254,7 @@
       <w:r>
         <w:t xml:space="preserve"> </w:t>
       </w:r>
-      <w:hyperlink r:id="rId26">
+      <w:hyperlink r:id="rId15">
         <w:r>
           <w:rPr>
             <w:rStyle w:val="Hyperlink"/>
@@ -558,43 +558,43 @@
         <w:rPr>
           <w:rStyle w:val="VerbatimChar"/>
         </w:rPr>
-        <w:t xml:space="preserve">✔ dplyr     1.1.4     ✔ readr     2.1.5</w:t>
-      </w:r>
-      <w:r>
-        <w:br/>
-      </w:r>
-      <w:r>
-        <w:rPr>
-          <w:rStyle w:val="VerbatimChar"/>
-        </w:rPr>
-        <w:t xml:space="preserve">✔ forcats   1.0.0     ✔ stringr   1.5.2</w:t>
-      </w:r>
-      <w:r>
-        <w:br/>
-      </w:r>
-      <w:r>
-        <w:rPr>
-          <w:rStyle w:val="VerbatimChar"/>
-        </w:rPr>
-        <w:t xml:space="preserve">✔ ggplot2   4.0.0     ✔ tibble    3.3.0</w:t>
-      </w:r>
-      <w:r>
-        <w:br/>
-      </w:r>
-      <w:r>
-        <w:rPr>
-          <w:rStyle w:val="VerbatimChar"/>
-        </w:rPr>
-        <w:t xml:space="preserve">✔ lubridate 1.9.4     ✔ tidyr     1.3.1</w:t>
-      </w:r>
-      <w:r>
-        <w:br/>
-      </w:r>
-      <w:r>
-        <w:rPr>
-          <w:rStyle w:val="VerbatimChar"/>
-        </w:rPr>
-        <w:t xml:space="preserve">✔ purrr     1.1.0     </w:t>
+        <w:t xml:space="preserve">✔ dplyr     1.2.1     ✔ readr     2.2.0</w:t>
+      </w:r>
+      <w:r>
+        <w:br/>
+      </w:r>
+      <w:r>
+        <w:rPr>
+          <w:rStyle w:val="VerbatimChar"/>
+        </w:rPr>
+        <w:t xml:space="preserve">✔ forcats   1.0.1     ✔ stringr   1.6.0</w:t>
+      </w:r>
+      <w:r>
+        <w:br/>
+      </w:r>
+      <w:r>
+        <w:rPr>
+          <w:rStyle w:val="VerbatimChar"/>
+        </w:rPr>
+        <w:t xml:space="preserve">✔ ggplot2   4.0.3     ✔ tibble    3.3.1</w:t>
+      </w:r>
+      <w:r>
+        <w:br/>
+      </w:r>
+      <w:r>
+        <w:rPr>
+          <w:rStyle w:val="VerbatimChar"/>
+        </w:rPr>
+        <w:t xml:space="preserve">✔ lubridate 1.9.5     ✔ tidyr     1.3.2</w:t>
+      </w:r>
+      <w:r>
+        <w:br/>
+      </w:r>
+      <w:r>
+        <w:rPr>
+          <w:rStyle w:val="VerbatimChar"/>
+        </w:rPr>
+        <w:t xml:space="preserve">✔ purrr     1.2.2     </w:t>
       </w:r>
       <w:r>
         <w:br/>
@@ -612,15 +612,6 @@
         <w:rPr>
           <w:rStyle w:val="VerbatimChar"/>
         </w:rPr>
-        <w:t xml:space="preserve">✖ purrr::%||%()   masks base::%||%()</w:t>
-      </w:r>
-      <w:r>
-        <w:br/>
-      </w:r>
-      <w:r>
-        <w:rPr>
-          <w:rStyle w:val="VerbatimChar"/>
-        </w:rPr>
         <w:t xml:space="preserve">✖ dplyr::filter() masks stats::filter()</w:t>
       </w:r>
       <w:r>
@@ -728,8 +719,8 @@
         <w:t xml:space="preserve">(reticulate)</w:t>
       </w:r>
     </w:p>
-    <w:bookmarkEnd w:id="27"/>
-    <w:bookmarkStart w:id="33" w:name="data-import-and-preparation"/>
+    <w:bookmarkEnd w:id="16"/>
+    <w:bookmarkStart w:id="22" w:name="data-import-and-preparation"/>
     <w:p>
       <w:pPr>
         <w:pStyle w:val="Heading2"/>
@@ -748,7 +739,7 @@
       <w:r>
         <w:t xml:space="preserve"> </w:t>
       </w:r>
-      <w:hyperlink r:id="rId28">
+      <w:hyperlink r:id="rId17">
         <w:r>
           <w:rPr>
             <w:rStyle w:val="Hyperlink"/>
@@ -762,7 +753,7 @@
       <w:r>
         <w:t xml:space="preserve"> </w:t>
       </w:r>
-      <w:hyperlink r:id="rId29">
+      <w:hyperlink r:id="rId18">
         <w:r>
           <w:rPr>
             <w:rStyle w:val="Hyperlink"/>
@@ -779,7 +770,7 @@
       <w:r>
         <w:t xml:space="preserve"> </w:t>
       </w:r>
-      <w:hyperlink r:id="rId30">
+      <w:hyperlink r:id="rId19">
         <w:r>
           <w:rPr>
             <w:rStyle w:val="Hyperlink"/>
@@ -796,7 +787,7 @@
       <w:r>
         <w:t xml:space="preserve"> </w:t>
       </w:r>
-      <w:hyperlink r:id="rId31">
+      <w:hyperlink r:id="rId20">
         <w:r>
           <w:rPr>
             <w:rStyle w:val="Hyperlink"/>
@@ -1005,7 +996,7 @@
         <w:rPr>
           <w:rStyle w:val="VerbatimChar"/>
         </w:rPr>
-        <w:t xml:space="preserve">Rows: 338405 Columns: 69</w:t>
+        <w:t xml:space="preserve">Rows: 372504 Columns: 70</w:t>
       </w:r>
       <w:r>
         <w:br/>
@@ -1041,7 +1032,7 @@
         <w:rPr>
           <w:rStyle w:val="VerbatimChar"/>
         </w:rPr>
-        <w:t xml:space="preserve">dbl (65): 1960, 1961, 1962, 1963, 1964, 1965, 1966, 1967, 1968, 1969, 1970, ...</w:t>
+        <w:t xml:space="preserve">dbl (66): 1960, 1961, 1962, 1963, 1964, 1965, 1966, 1967, 1968, 1969, 1970, ...</w:t>
       </w:r>
       <w:r>
         <w:br/>
@@ -1569,7 +1560,7 @@
         <w:rPr>
           <w:rStyle w:val="DecValTok"/>
         </w:rPr>
-        <w:t xml:space="preserve">67</w:t>
+        <w:t xml:space="preserve">68</w:t>
       </w:r>
       <w:r>
         <w:rPr>
@@ -1644,7 +1635,7 @@
         <w:rPr>
           <w:rStyle w:val="NormalTok"/>
         </w:rPr>
-        <w:t xml:space="preserve">gender_data2023 </w:t>
+        <w:t xml:space="preserve">gender_data2024 </w:t>
       </w:r>
       <w:r>
         <w:rPr>
@@ -1698,6 +1689,864 @@
         <w:rPr>
           <w:rStyle w:val="StringTok"/>
         </w:rPr>
+        <w:t xml:space="preserve">"2024"</w:t>
+      </w:r>
+      <w:r>
+        <w:rPr>
+          <w:rStyle w:val="NormalTok"/>
+        </w:rPr>
+        <w:t xml:space="preserve">)</w:t>
+      </w:r>
+      <w:r>
+        <w:br/>
+      </w:r>
+      <w:r>
+        <w:br/>
+      </w:r>
+      <w:r>
+        <w:rPr>
+          <w:rStyle w:val="NormalTok"/>
+        </w:rPr>
+        <w:t xml:space="preserve">gender_data2024 </w:t>
+      </w:r>
+      <w:r>
+        <w:rPr>
+          <w:rStyle w:val="OtherTok"/>
+        </w:rPr>
+        <w:t xml:space="preserve">&lt;-</w:t>
+      </w:r>
+      <w:r>
+        <w:rPr>
+          <w:rStyle w:val="NormalTok"/>
+        </w:rPr>
+        <w:t xml:space="preserve"> gender_data2024[,</w:t>
+      </w:r>
+      <w:r>
+        <w:rPr>
+          <w:rStyle w:val="SpecialCharTok"/>
+        </w:rPr>
+        <w:t xml:space="preserve">-</w:t>
+      </w:r>
+      <w:r>
+        <w:rPr>
+          <w:rStyle w:val="DecValTok"/>
+        </w:rPr>
+        <w:t xml:space="preserve">3</w:t>
+      </w:r>
+      <w:r>
+        <w:rPr>
+          <w:rStyle w:val="NormalTok"/>
+        </w:rPr>
+        <w:t xml:space="preserve">]</w:t>
+      </w:r>
+      <w:r>
+        <w:br/>
+      </w:r>
+      <w:r>
+        <w:br/>
+      </w:r>
+      <w:r>
+        <w:rPr>
+          <w:rStyle w:val="NormalTok"/>
+        </w:rPr>
+        <w:t xml:space="preserve">gender_data2024wide </w:t>
+      </w:r>
+      <w:r>
+        <w:rPr>
+          <w:rStyle w:val="OtherTok"/>
+        </w:rPr>
+        <w:t xml:space="preserve">&lt;-</w:t>
+      </w:r>
+      <w:r>
+        <w:br/>
+      </w:r>
+      <w:r>
+        <w:rPr>
+          <w:rStyle w:val="NormalTok"/>
+        </w:rPr>
+        <w:t xml:space="preserve">  gender_data2024 </w:t>
+      </w:r>
+      <w:r>
+        <w:rPr>
+          <w:rStyle w:val="SpecialCharTok"/>
+        </w:rPr>
+        <w:t xml:space="preserve">%&gt;%</w:t>
+      </w:r>
+      <w:r>
+        <w:br/>
+      </w:r>
+      <w:r>
+        <w:rPr>
+          <w:rStyle w:val="NormalTok"/>
+        </w:rPr>
+        <w:t xml:space="preserve">  </w:t>
+      </w:r>
+      <w:r>
+        <w:rPr>
+          <w:rStyle w:val="FunctionTok"/>
+        </w:rPr>
+        <w:t xml:space="preserve">pivot_wider</w:t>
+      </w:r>
+      <w:r>
+        <w:rPr>
+          <w:rStyle w:val="NormalTok"/>
+        </w:rPr>
+        <w:t xml:space="preserve">(</w:t>
+      </w:r>
+      <w:r>
+        <w:rPr>
+          <w:rStyle w:val="AttributeTok"/>
+        </w:rPr>
+        <w:t xml:space="preserve">names_from =</w:t>
+      </w:r>
+      <w:r>
+        <w:rPr>
+          <w:rStyle w:val="NormalTok"/>
+        </w:rPr>
+        <w:t xml:space="preserve"> </w:t>
+      </w:r>
+      <w:r>
+        <w:rPr>
+          <w:rStyle w:val="StringTok"/>
+        </w:rPr>
+        <w:t xml:space="preserve">"Indicator Name"</w:t>
+      </w:r>
+      <w:r>
+        <w:rPr>
+          <w:rStyle w:val="NormalTok"/>
+        </w:rPr>
+        <w:t xml:space="preserve">, </w:t>
+      </w:r>
+      <w:r>
+        <w:rPr>
+          <w:rStyle w:val="AttributeTok"/>
+        </w:rPr>
+        <w:t xml:space="preserve">values_from =</w:t>
+      </w:r>
+      <w:r>
+        <w:rPr>
+          <w:rStyle w:val="NormalTok"/>
+        </w:rPr>
+        <w:t xml:space="preserve"> </w:t>
+      </w:r>
+      <w:r>
+        <w:rPr>
+          <w:rStyle w:val="StringTok"/>
+        </w:rPr>
+        <w:t xml:space="preserve">"Value"</w:t>
+      </w:r>
+      <w:r>
+        <w:rPr>
+          <w:rStyle w:val="NormalTok"/>
+        </w:rPr>
+        <w:t xml:space="preserve">)</w:t>
+      </w:r>
+      <w:r>
+        <w:br/>
+      </w:r>
+      <w:r>
+        <w:br/>
+      </w:r>
+      <w:r>
+        <w:rPr>
+          <w:rStyle w:val="CommentTok"/>
+        </w:rPr>
+        <w:t xml:space="preserve"># now use a little sapply trick to select variables that don't have much missing data - here the proportion is 0.75 (the 0.25 in the function is 1-proportion desired)</w:t>
+      </w:r>
+      <w:r>
+        <w:br/>
+      </w:r>
+      <w:r>
+        <w:br/>
+      </w:r>
+      <w:r>
+        <w:rPr>
+          <w:rStyle w:val="NormalTok"/>
+        </w:rPr>
+        <w:t xml:space="preserve">gender_data_filtered </w:t>
+      </w:r>
+      <w:r>
+        <w:rPr>
+          <w:rStyle w:val="OtherTok"/>
+        </w:rPr>
+        <w:t xml:space="preserve">&lt;-</w:t>
+      </w:r>
+      <w:r>
+        <w:rPr>
+          <w:rStyle w:val="NormalTok"/>
+        </w:rPr>
+        <w:t xml:space="preserve"> gender_data2024wide[,</w:t>
+      </w:r>
+      <w:r>
+        <w:rPr>
+          <w:rStyle w:val="SpecialCharTok"/>
+        </w:rPr>
+        <w:t xml:space="preserve">!</w:t>
+      </w:r>
+      <w:r>
+        <w:rPr>
+          <w:rStyle w:val="FunctionTok"/>
+        </w:rPr>
+        <w:t xml:space="preserve">sapply</w:t>
+      </w:r>
+      <w:r>
+        <w:rPr>
+          <w:rStyle w:val="NormalTok"/>
+        </w:rPr>
+        <w:t xml:space="preserve">(gender_data2024wide, </w:t>
+      </w:r>
+      <w:r>
+        <w:rPr>
+          <w:rStyle w:val="ControlFlowTok"/>
+        </w:rPr>
+        <w:t xml:space="preserve">function</w:t>
+      </w:r>
+      <w:r>
+        <w:rPr>
+          <w:rStyle w:val="NormalTok"/>
+        </w:rPr>
+        <w:t xml:space="preserve">(x) </w:t>
+      </w:r>
+      <w:r>
+        <w:rPr>
+          <w:rStyle w:val="FunctionTok"/>
+        </w:rPr>
+        <w:t xml:space="preserve">mean</w:t>
+      </w:r>
+      <w:r>
+        <w:rPr>
+          <w:rStyle w:val="NormalTok"/>
+        </w:rPr>
+        <w:t xml:space="preserve">(</w:t>
+      </w:r>
+      <w:r>
+        <w:rPr>
+          <w:rStyle w:val="FunctionTok"/>
+        </w:rPr>
+        <w:t xml:space="preserve">is.na</w:t>
+      </w:r>
+      <w:r>
+        <w:rPr>
+          <w:rStyle w:val="NormalTok"/>
+        </w:rPr>
+        <w:t xml:space="preserve">(x)))</w:t>
+      </w:r>
+      <w:r>
+        <w:rPr>
+          <w:rStyle w:val="SpecialCharTok"/>
+        </w:rPr>
+        <w:t xml:space="preserve">&gt;</w:t>
+      </w:r>
+      <w:r>
+        <w:rPr>
+          <w:rStyle w:val="FloatTok"/>
+        </w:rPr>
+        <w:t xml:space="preserve">0.25</w:t>
+      </w:r>
+      <w:r>
+        <w:rPr>
+          <w:rStyle w:val="NormalTok"/>
+        </w:rPr>
+        <w:t xml:space="preserve">]</w:t>
+      </w:r>
+      <w:r>
+        <w:br/>
+      </w:r>
+      <w:r>
+        <w:br/>
+      </w:r>
+      <w:r>
+        <w:rPr>
+          <w:rStyle w:val="CommentTok"/>
+        </w:rPr>
+        <w:t xml:space="preserve"># and lastly simplify the dataset by removing some of the topics we won't use</w:t>
+      </w:r>
+      <w:r>
+        <w:br/>
+      </w:r>
+      <w:r>
+        <w:br/>
+      </w:r>
+      <w:r>
+        <w:rPr>
+          <w:rStyle w:val="NormalTok"/>
+        </w:rPr>
+        <w:t xml:space="preserve">phrases </w:t>
+      </w:r>
+      <w:r>
+        <w:rPr>
+          <w:rStyle w:val="OtherTok"/>
+        </w:rPr>
+        <w:t xml:space="preserve">&lt;-</w:t>
+      </w:r>
+      <w:r>
+        <w:rPr>
+          <w:rStyle w:val="NormalTok"/>
+        </w:rPr>
+        <w:t xml:space="preserve"> </w:t>
+      </w:r>
+      <w:r>
+        <w:rPr>
+          <w:rStyle w:val="FunctionTok"/>
+        </w:rPr>
+        <w:t xml:space="preserve">c</w:t>
+      </w:r>
+      <w:r>
+        <w:rPr>
+          <w:rStyle w:val="NormalTok"/>
+        </w:rPr>
+        <w:t xml:space="preserve">(</w:t>
+      </w:r>
+      <w:r>
+        <w:rPr>
+          <w:rStyle w:val="StringTok"/>
+        </w:rPr>
+        <w:t xml:space="preserve">"Worried"</w:t>
+      </w:r>
+      <w:r>
+        <w:rPr>
+          <w:rStyle w:val="NormalTok"/>
+        </w:rPr>
+        <w:t xml:space="preserve">, </w:t>
+      </w:r>
+      <w:r>
+        <w:rPr>
+          <w:rStyle w:val="StringTok"/>
+        </w:rPr>
+        <w:t xml:space="preserve">"Made"</w:t>
+      </w:r>
+      <w:r>
+        <w:rPr>
+          <w:rStyle w:val="NormalTok"/>
+        </w:rPr>
+        <w:t xml:space="preserve">, </w:t>
+      </w:r>
+      <w:r>
+        <w:rPr>
+          <w:rStyle w:val="StringTok"/>
+        </w:rPr>
+        <w:t xml:space="preserve">"Received"</w:t>
+      </w:r>
+      <w:r>
+        <w:rPr>
+          <w:rStyle w:val="NormalTok"/>
+        </w:rPr>
+        <w:t xml:space="preserve">, </w:t>
+      </w:r>
+      <w:r>
+        <w:rPr>
+          <w:rStyle w:val="StringTok"/>
+        </w:rPr>
+        <w:t xml:space="preserve">"Saved"</w:t>
+      </w:r>
+      <w:r>
+        <w:rPr>
+          <w:rStyle w:val="NormalTok"/>
+        </w:rPr>
+        <w:t xml:space="preserve">, </w:t>
+      </w:r>
+      <w:r>
+        <w:rPr>
+          <w:rStyle w:val="StringTok"/>
+        </w:rPr>
+        <w:t xml:space="preserve">"Used"</w:t>
+      </w:r>
+      <w:r>
+        <w:rPr>
+          <w:rStyle w:val="NormalTok"/>
+        </w:rPr>
+        <w:t xml:space="preserve">, </w:t>
+      </w:r>
+      <w:r>
+        <w:rPr>
+          <w:rStyle w:val="StringTok"/>
+        </w:rPr>
+        <w:t xml:space="preserve">"Coming"</w:t>
+      </w:r>
+      <w:r>
+        <w:rPr>
+          <w:rStyle w:val="NormalTok"/>
+        </w:rPr>
+        <w:t xml:space="preserve">, </w:t>
+      </w:r>
+      <w:r>
+        <w:rPr>
+          <w:rStyle w:val="StringTok"/>
+        </w:rPr>
+        <w:t xml:space="preserve">"Borrowed"</w:t>
+      </w:r>
+      <w:r>
+        <w:rPr>
+          <w:rStyle w:val="NormalTok"/>
+        </w:rPr>
+        <w:t xml:space="preserve">)</w:t>
+      </w:r>
+      <w:r>
+        <w:br/>
+      </w:r>
+      <w:r>
+        <w:br/>
+      </w:r>
+      <w:r>
+        <w:rPr>
+          <w:rStyle w:val="NormalTok"/>
+        </w:rPr>
+        <w:t xml:space="preserve">gender_data_final </w:t>
+      </w:r>
+      <w:r>
+        <w:rPr>
+          <w:rStyle w:val="OtherTok"/>
+        </w:rPr>
+        <w:t xml:space="preserve">&lt;-</w:t>
+      </w:r>
+      <w:r>
+        <w:rPr>
+          <w:rStyle w:val="NormalTok"/>
+        </w:rPr>
+        <w:t xml:space="preserve"> </w:t>
+      </w:r>
+      <w:r>
+        <w:br/>
+      </w:r>
+      <w:r>
+        <w:rPr>
+          <w:rStyle w:val="NormalTok"/>
+        </w:rPr>
+        <w:t xml:space="preserve">  gender_data_filtered </w:t>
+      </w:r>
+      <w:r>
+        <w:rPr>
+          <w:rStyle w:val="SpecialCharTok"/>
+        </w:rPr>
+        <w:t xml:space="preserve">%&gt;%</w:t>
+      </w:r>
+      <w:r>
+        <w:br/>
+      </w:r>
+      <w:r>
+        <w:rPr>
+          <w:rStyle w:val="NormalTok"/>
+        </w:rPr>
+        <w:t xml:space="preserve">  </w:t>
+      </w:r>
+      <w:r>
+        <w:rPr>
+          <w:rStyle w:val="FunctionTok"/>
+        </w:rPr>
+        <w:t xml:space="preserve">select</w:t>
+      </w:r>
+      <w:r>
+        <w:rPr>
+          <w:rStyle w:val="NormalTok"/>
+        </w:rPr>
+        <w:t xml:space="preserve">(</w:t>
+      </w:r>
+      <w:r>
+        <w:rPr>
+          <w:rStyle w:val="SpecialCharTok"/>
+        </w:rPr>
+        <w:t xml:space="preserve">!</w:t>
+      </w:r>
+      <w:r>
+        <w:rPr>
+          <w:rStyle w:val="FunctionTok"/>
+        </w:rPr>
+        <w:t xml:space="preserve">starts_with</w:t>
+      </w:r>
+      <w:r>
+        <w:rPr>
+          <w:rStyle w:val="NormalTok"/>
+        </w:rPr>
+        <w:t xml:space="preserve">(phrases))</w:t>
+      </w:r>
+      <w:r>
+        <w:br/>
+      </w:r>
+      <w:r>
+        <w:br/>
+      </w:r>
+      <w:r>
+        <w:rPr>
+          <w:rStyle w:val="CommentTok"/>
+        </w:rPr>
+        <w:t xml:space="preserve"># we'll also generate a couple of variables for future use</w:t>
+      </w:r>
+      <w:r>
+        <w:br/>
+      </w:r>
+      <w:r>
+        <w:br/>
+      </w:r>
+      <w:r>
+        <w:rPr>
+          <w:rStyle w:val="NormalTok"/>
+        </w:rPr>
+        <w:t xml:space="preserve">gender_data_final</w:t>
+      </w:r>
+      <w:r>
+        <w:rPr>
+          <w:rStyle w:val="SpecialCharTok"/>
+        </w:rPr>
+        <w:t xml:space="preserve">$</w:t>
+      </w:r>
+      <w:r>
+        <w:rPr>
+          <w:rStyle w:val="NormalTok"/>
+        </w:rPr>
+        <w:t xml:space="preserve">female_high_labor </w:t>
+      </w:r>
+      <w:r>
+        <w:rPr>
+          <w:rStyle w:val="OtherTok"/>
+        </w:rPr>
+        <w:t xml:space="preserve">&lt;-</w:t>
+      </w:r>
+      <w:r>
+        <w:rPr>
+          <w:rStyle w:val="NormalTok"/>
+        </w:rPr>
+        <w:t xml:space="preserve"> gender_data_final</w:t>
+      </w:r>
+      <w:r>
+        <w:rPr>
+          <w:rStyle w:val="SpecialCharTok"/>
+        </w:rPr>
+        <w:t xml:space="preserve">$</w:t>
+      </w:r>
+      <w:r>
+        <w:rPr>
+          <w:rStyle w:val="StringTok"/>
+        </w:rPr>
+        <w:t xml:space="preserve">`</w:t>
+      </w:r>
+      <w:r>
+        <w:rPr>
+          <w:rStyle w:val="AttributeTok"/>
+        </w:rPr>
+        <w:t xml:space="preserve">Labor force participation rate, female (% of female population ages 15-64) (modeled ILO estimate)</w:t>
+      </w:r>
+      <w:r>
+        <w:rPr>
+          <w:rStyle w:val="StringTok"/>
+        </w:rPr>
+        <w:t xml:space="preserve">`</w:t>
+      </w:r>
+      <w:r>
+        <w:rPr>
+          <w:rStyle w:val="SpecialCharTok"/>
+        </w:rPr>
+        <w:t xml:space="preserve">&gt;</w:t>
+      </w:r>
+      <w:r>
+        <w:rPr>
+          <w:rStyle w:val="DecValTok"/>
+        </w:rPr>
+        <w:t xml:space="preserve">70</w:t>
+      </w:r>
+      <w:r>
+        <w:br/>
+      </w:r>
+      <w:r>
+        <w:rPr>
+          <w:rStyle w:val="NormalTok"/>
+        </w:rPr>
+        <w:t xml:space="preserve">gender_data_final</w:t>
+      </w:r>
+      <w:r>
+        <w:rPr>
+          <w:rStyle w:val="SpecialCharTok"/>
+        </w:rPr>
+        <w:t xml:space="preserve">$</w:t>
+      </w:r>
+      <w:r>
+        <w:rPr>
+          <w:rStyle w:val="NormalTok"/>
+        </w:rPr>
+        <w:t xml:space="preserve">male_high_labor </w:t>
+      </w:r>
+      <w:r>
+        <w:rPr>
+          <w:rStyle w:val="OtherTok"/>
+        </w:rPr>
+        <w:t xml:space="preserve">&lt;-</w:t>
+      </w:r>
+      <w:r>
+        <w:rPr>
+          <w:rStyle w:val="NormalTok"/>
+        </w:rPr>
+        <w:t xml:space="preserve"> gender_data_final</w:t>
+      </w:r>
+      <w:r>
+        <w:rPr>
+          <w:rStyle w:val="SpecialCharTok"/>
+        </w:rPr>
+        <w:t xml:space="preserve">$</w:t>
+      </w:r>
+      <w:r>
+        <w:rPr>
+          <w:rStyle w:val="StringTok"/>
+        </w:rPr>
+        <w:t xml:space="preserve">`</w:t>
+      </w:r>
+      <w:r>
+        <w:rPr>
+          <w:rStyle w:val="AttributeTok"/>
+        </w:rPr>
+        <w:t xml:space="preserve">Labor force participation rate, male (% of male population ages 15-64) (modeled ILO estimate)</w:t>
+      </w:r>
+      <w:r>
+        <w:rPr>
+          <w:rStyle w:val="StringTok"/>
+        </w:rPr>
+        <w:t xml:space="preserve">`</w:t>
+      </w:r>
+      <w:r>
+        <w:rPr>
+          <w:rStyle w:val="SpecialCharTok"/>
+        </w:rPr>
+        <w:t xml:space="preserve">&gt;</w:t>
+      </w:r>
+      <w:r>
+        <w:rPr>
+          <w:rStyle w:val="DecValTok"/>
+        </w:rPr>
+        <w:t xml:space="preserve">70</w:t>
+      </w:r>
+      <w:r>
+        <w:rPr>
+          <w:rStyle w:val="NormalTok"/>
+        </w:rPr>
+        <w:t xml:space="preserve"> </w:t>
+      </w:r>
+      <w:r>
+        <w:br/>
+      </w:r>
+      <w:r>
+        <w:br/>
+      </w:r>
+      <w:r>
+        <w:rPr>
+          <w:rStyle w:val="FunctionTok"/>
+        </w:rPr>
+        <w:t xml:space="preserve">attach</w:t>
+      </w:r>
+      <w:r>
+        <w:rPr>
+          <w:rStyle w:val="NormalTok"/>
+        </w:rPr>
+        <w:t xml:space="preserve">(gender_data_final)</w:t>
+      </w:r>
+      <w:r>
+        <w:br/>
+      </w:r>
+      <w:r>
+        <w:br/>
+      </w:r>
+      <w:r>
+        <w:rPr>
+          <w:rStyle w:val="CommentTok"/>
+        </w:rPr>
+        <w:t xml:space="preserve"># also prepare (for Bootstrap section, a non-country filtered version of the data)</w:t>
+      </w:r>
+      <w:r>
+        <w:br/>
+      </w:r>
+      <w:r>
+        <w:br/>
+      </w:r>
+      <w:r>
+        <w:rPr>
+          <w:rStyle w:val="NormalTok"/>
+        </w:rPr>
+        <w:t xml:space="preserve">gender_data4 </w:t>
+      </w:r>
+      <w:r>
+        <w:rPr>
+          <w:rStyle w:val="OtherTok"/>
+        </w:rPr>
+        <w:t xml:space="preserve">&lt;-</w:t>
+      </w:r>
+      <w:r>
+        <w:br/>
+      </w:r>
+      <w:r>
+        <w:rPr>
+          <w:rStyle w:val="NormalTok"/>
+        </w:rPr>
+        <w:t xml:space="preserve">   gender_data </w:t>
+      </w:r>
+      <w:r>
+        <w:rPr>
+          <w:rStyle w:val="SpecialCharTok"/>
+        </w:rPr>
+        <w:t xml:space="preserve">%&gt;%</w:t>
+      </w:r>
+      <w:r>
+        <w:br/>
+      </w:r>
+      <w:r>
+        <w:rPr>
+          <w:rStyle w:val="NormalTok"/>
+        </w:rPr>
+        <w:t xml:space="preserve">   </w:t>
+      </w:r>
+      <w:r>
+        <w:rPr>
+          <w:rStyle w:val="FunctionTok"/>
+        </w:rPr>
+        <w:t xml:space="preserve">pivot_longer</w:t>
+      </w:r>
+      <w:r>
+        <w:rPr>
+          <w:rStyle w:val="NormalTok"/>
+        </w:rPr>
+        <w:t xml:space="preserve">(</w:t>
+      </w:r>
+      <w:r>
+        <w:rPr>
+          <w:rStyle w:val="DecValTok"/>
+        </w:rPr>
+        <w:t xml:space="preserve">3</w:t>
+      </w:r>
+      <w:r>
+        <w:rPr>
+          <w:rStyle w:val="SpecialCharTok"/>
+        </w:rPr>
+        <w:t xml:space="preserve">:</w:t>
+      </w:r>
+      <w:r>
+        <w:rPr>
+          <w:rStyle w:val="DecValTok"/>
+        </w:rPr>
+        <w:t xml:space="preserve">68</w:t>
+      </w:r>
+      <w:r>
+        <w:rPr>
+          <w:rStyle w:val="NormalTok"/>
+        </w:rPr>
+        <w:t xml:space="preserve">, </w:t>
+      </w:r>
+      <w:r>
+        <w:rPr>
+          <w:rStyle w:val="AttributeTok"/>
+        </w:rPr>
+        <w:t xml:space="preserve">names_to =</w:t>
+      </w:r>
+      <w:r>
+        <w:rPr>
+          <w:rStyle w:val="NormalTok"/>
+        </w:rPr>
+        <w:t xml:space="preserve"> </w:t>
+      </w:r>
+      <w:r>
+        <w:rPr>
+          <w:rStyle w:val="StringTok"/>
+        </w:rPr>
+        <w:t xml:space="preserve">"Year"</w:t>
+      </w:r>
+      <w:r>
+        <w:rPr>
+          <w:rStyle w:val="NormalTok"/>
+        </w:rPr>
+        <w:t xml:space="preserve">, </w:t>
+      </w:r>
+      <w:r>
+        <w:rPr>
+          <w:rStyle w:val="AttributeTok"/>
+        </w:rPr>
+        <w:t xml:space="preserve">values_to =</w:t>
+      </w:r>
+      <w:r>
+        <w:rPr>
+          <w:rStyle w:val="NormalTok"/>
+        </w:rPr>
+        <w:t xml:space="preserve"> </w:t>
+      </w:r>
+      <w:r>
+        <w:rPr>
+          <w:rStyle w:val="StringTok"/>
+        </w:rPr>
+        <w:t xml:space="preserve">"Value"</w:t>
+      </w:r>
+      <w:r>
+        <w:rPr>
+          <w:rStyle w:val="NormalTok"/>
+        </w:rPr>
+        <w:t xml:space="preserve">)</w:t>
+      </w:r>
+      <w:r>
+        <w:br/>
+      </w:r>
+      <w:r>
+        <w:br/>
+      </w:r>
+      <w:r>
+        <w:rPr>
+          <w:rStyle w:val="CommentTok"/>
+        </w:rPr>
+        <w:t xml:space="preserve">#filter by year</w:t>
+      </w:r>
+      <w:r>
+        <w:br/>
+      </w:r>
+      <w:r>
+        <w:rPr>
+          <w:rStyle w:val="NormalTok"/>
+        </w:rPr>
+        <w:t xml:space="preserve">gender_data2023_full </w:t>
+      </w:r>
+      <w:r>
+        <w:rPr>
+          <w:rStyle w:val="OtherTok"/>
+        </w:rPr>
+        <w:t xml:space="preserve">&lt;-</w:t>
+      </w:r>
+      <w:r>
+        <w:br/>
+      </w:r>
+      <w:r>
+        <w:rPr>
+          <w:rStyle w:val="NormalTok"/>
+        </w:rPr>
+        <w:t xml:space="preserve">  gender_data4 </w:t>
+      </w:r>
+      <w:r>
+        <w:rPr>
+          <w:rStyle w:val="SpecialCharTok"/>
+        </w:rPr>
+        <w:t xml:space="preserve">%&gt;%</w:t>
+      </w:r>
+      <w:r>
+        <w:br/>
+      </w:r>
+      <w:r>
+        <w:rPr>
+          <w:rStyle w:val="NormalTok"/>
+        </w:rPr>
+        <w:t xml:space="preserve">  </w:t>
+      </w:r>
+      <w:r>
+        <w:rPr>
+          <w:rStyle w:val="FunctionTok"/>
+        </w:rPr>
+        <w:t xml:space="preserve">filter</w:t>
+      </w:r>
+      <w:r>
+        <w:rPr>
+          <w:rStyle w:val="NormalTok"/>
+        </w:rPr>
+        <w:t xml:space="preserve">(Year</w:t>
+      </w:r>
+      <w:r>
+        <w:rPr>
+          <w:rStyle w:val="SpecialCharTok"/>
+        </w:rPr>
+        <w:t xml:space="preserve">==</w:t>
+      </w:r>
+      <w:r>
+        <w:rPr>
+          <w:rStyle w:val="StringTok"/>
+        </w:rPr>
         <w:t xml:space="preserve">"2023"</w:t>
       </w:r>
       <w:r>
@@ -1716,7 +2565,7 @@
         <w:rPr>
           <w:rStyle w:val="NormalTok"/>
         </w:rPr>
-        <w:t xml:space="preserve">gender_data2023 </w:t>
+        <w:t xml:space="preserve">gender_data2023_full </w:t>
       </w:r>
       <w:r>
         <w:rPr>
@@ -1728,7 +2577,7 @@
         <w:rPr>
           <w:rStyle w:val="NormalTok"/>
         </w:rPr>
-        <w:t xml:space="preserve"> gender_data2023[,</w:t>
+        <w:t xml:space="preserve"> gender_data2023_full[,</w:t>
       </w:r>
       <w:r>
         <w:rPr>
@@ -1758,7 +2607,7 @@
         <w:rPr>
           <w:rStyle w:val="NormalTok"/>
         </w:rPr>
-        <w:t xml:space="preserve">gender_data2023wide </w:t>
+        <w:t xml:space="preserve">gender_data2023wide_full </w:t>
       </w:r>
       <w:r>
         <w:rPr>
@@ -1773,7 +2622,7 @@
         <w:rPr>
           <w:rStyle w:val="NormalTok"/>
         </w:rPr>
-        <w:t xml:space="preserve">  gender_data2023 </w:t>
+        <w:t xml:space="preserve">  gender_data2023_full </w:t>
       </w:r>
       <w:r>
         <w:rPr>
@@ -1850,501 +2699,6 @@
         </w:rPr>
         <w:t xml:space="preserve">)</w:t>
       </w:r>
-      <w:r>
-        <w:br/>
-      </w:r>
-      <w:r>
-        <w:br/>
-      </w:r>
-      <w:r>
-        <w:rPr>
-          <w:rStyle w:val="CommentTok"/>
-        </w:rPr>
-        <w:t xml:space="preserve"># now use a little sapply trick to select variables that don't have much missing data - here the proportion is 0.75 (the 0.25 in the function is 1-proportion desired)</w:t>
-      </w:r>
-      <w:r>
-        <w:br/>
-      </w:r>
-      <w:r>
-        <w:br/>
-      </w:r>
-      <w:r>
-        <w:rPr>
-          <w:rStyle w:val="NormalTok"/>
-        </w:rPr>
-        <w:t xml:space="preserve">gender_data_filtered </w:t>
-      </w:r>
-      <w:r>
-        <w:rPr>
-          <w:rStyle w:val="OtherTok"/>
-        </w:rPr>
-        <w:t xml:space="preserve">&lt;-</w:t>
-      </w:r>
-      <w:r>
-        <w:rPr>
-          <w:rStyle w:val="NormalTok"/>
-        </w:rPr>
-        <w:t xml:space="preserve"> gender_data2023wide[,</w:t>
-      </w:r>
-      <w:r>
-        <w:rPr>
-          <w:rStyle w:val="SpecialCharTok"/>
-        </w:rPr>
-        <w:t xml:space="preserve">!</w:t>
-      </w:r>
-      <w:r>
-        <w:rPr>
-          <w:rStyle w:val="FunctionTok"/>
-        </w:rPr>
-        <w:t xml:space="preserve">sapply</w:t>
-      </w:r>
-      <w:r>
-        <w:rPr>
-          <w:rStyle w:val="NormalTok"/>
-        </w:rPr>
-        <w:t xml:space="preserve">(gender_data2023wide, </w:t>
-      </w:r>
-      <w:r>
-        <w:rPr>
-          <w:rStyle w:val="ControlFlowTok"/>
-        </w:rPr>
-        <w:t xml:space="preserve">function</w:t>
-      </w:r>
-      <w:r>
-        <w:rPr>
-          <w:rStyle w:val="NormalTok"/>
-        </w:rPr>
-        <w:t xml:space="preserve">(x) </w:t>
-      </w:r>
-      <w:r>
-        <w:rPr>
-          <w:rStyle w:val="FunctionTok"/>
-        </w:rPr>
-        <w:t xml:space="preserve">mean</w:t>
-      </w:r>
-      <w:r>
-        <w:rPr>
-          <w:rStyle w:val="NormalTok"/>
-        </w:rPr>
-        <w:t xml:space="preserve">(</w:t>
-      </w:r>
-      <w:r>
-        <w:rPr>
-          <w:rStyle w:val="FunctionTok"/>
-        </w:rPr>
-        <w:t xml:space="preserve">is.na</w:t>
-      </w:r>
-      <w:r>
-        <w:rPr>
-          <w:rStyle w:val="NormalTok"/>
-        </w:rPr>
-        <w:t xml:space="preserve">(x)))</w:t>
-      </w:r>
-      <w:r>
-        <w:rPr>
-          <w:rStyle w:val="SpecialCharTok"/>
-        </w:rPr>
-        <w:t xml:space="preserve">&gt;</w:t>
-      </w:r>
-      <w:r>
-        <w:rPr>
-          <w:rStyle w:val="FloatTok"/>
-        </w:rPr>
-        <w:t xml:space="preserve">0.25</w:t>
-      </w:r>
-      <w:r>
-        <w:rPr>
-          <w:rStyle w:val="NormalTok"/>
-        </w:rPr>
-        <w:t xml:space="preserve">]</w:t>
-      </w:r>
-      <w:r>
-        <w:br/>
-      </w:r>
-      <w:r>
-        <w:br/>
-      </w:r>
-      <w:r>
-        <w:rPr>
-          <w:rStyle w:val="CommentTok"/>
-        </w:rPr>
-        <w:t xml:space="preserve"># and lastly simplify the dataset by removing some of the topics we won't use</w:t>
-      </w:r>
-      <w:r>
-        <w:br/>
-      </w:r>
-      <w:r>
-        <w:br/>
-      </w:r>
-      <w:r>
-        <w:rPr>
-          <w:rStyle w:val="NormalTok"/>
-        </w:rPr>
-        <w:t xml:space="preserve">phrases </w:t>
-      </w:r>
-      <w:r>
-        <w:rPr>
-          <w:rStyle w:val="OtherTok"/>
-        </w:rPr>
-        <w:t xml:space="preserve">&lt;-</w:t>
-      </w:r>
-      <w:r>
-        <w:rPr>
-          <w:rStyle w:val="NormalTok"/>
-        </w:rPr>
-        <w:t xml:space="preserve"> </w:t>
-      </w:r>
-      <w:r>
-        <w:rPr>
-          <w:rStyle w:val="FunctionTok"/>
-        </w:rPr>
-        <w:t xml:space="preserve">c</w:t>
-      </w:r>
-      <w:r>
-        <w:rPr>
-          <w:rStyle w:val="NormalTok"/>
-        </w:rPr>
-        <w:t xml:space="preserve">(</w:t>
-      </w:r>
-      <w:r>
-        <w:rPr>
-          <w:rStyle w:val="StringTok"/>
-        </w:rPr>
-        <w:t xml:space="preserve">"Worried"</w:t>
-      </w:r>
-      <w:r>
-        <w:rPr>
-          <w:rStyle w:val="NormalTok"/>
-        </w:rPr>
-        <w:t xml:space="preserve">, </w:t>
-      </w:r>
-      <w:r>
-        <w:rPr>
-          <w:rStyle w:val="StringTok"/>
-        </w:rPr>
-        <w:t xml:space="preserve">"Made"</w:t>
-      </w:r>
-      <w:r>
-        <w:rPr>
-          <w:rStyle w:val="NormalTok"/>
-        </w:rPr>
-        <w:t xml:space="preserve">, </w:t>
-      </w:r>
-      <w:r>
-        <w:rPr>
-          <w:rStyle w:val="StringTok"/>
-        </w:rPr>
-        <w:t xml:space="preserve">"Received"</w:t>
-      </w:r>
-      <w:r>
-        <w:rPr>
-          <w:rStyle w:val="NormalTok"/>
-        </w:rPr>
-        <w:t xml:space="preserve">, </w:t>
-      </w:r>
-      <w:r>
-        <w:rPr>
-          <w:rStyle w:val="StringTok"/>
-        </w:rPr>
-        <w:t xml:space="preserve">"Saved"</w:t>
-      </w:r>
-      <w:r>
-        <w:rPr>
-          <w:rStyle w:val="NormalTok"/>
-        </w:rPr>
-        <w:t xml:space="preserve">, </w:t>
-      </w:r>
-      <w:r>
-        <w:rPr>
-          <w:rStyle w:val="StringTok"/>
-        </w:rPr>
-        <w:t xml:space="preserve">"Used"</w:t>
-      </w:r>
-      <w:r>
-        <w:rPr>
-          <w:rStyle w:val="NormalTok"/>
-        </w:rPr>
-        <w:t xml:space="preserve">, </w:t>
-      </w:r>
-      <w:r>
-        <w:rPr>
-          <w:rStyle w:val="StringTok"/>
-        </w:rPr>
-        <w:t xml:space="preserve">"Coming"</w:t>
-      </w:r>
-      <w:r>
-        <w:rPr>
-          <w:rStyle w:val="NormalTok"/>
-        </w:rPr>
-        <w:t xml:space="preserve">, </w:t>
-      </w:r>
-      <w:r>
-        <w:rPr>
-          <w:rStyle w:val="StringTok"/>
-        </w:rPr>
-        <w:t xml:space="preserve">"Borrowed"</w:t>
-      </w:r>
-      <w:r>
-        <w:rPr>
-          <w:rStyle w:val="NormalTok"/>
-        </w:rPr>
-        <w:t xml:space="preserve">)</w:t>
-      </w:r>
-      <w:r>
-        <w:br/>
-      </w:r>
-      <w:r>
-        <w:br/>
-      </w:r>
-      <w:r>
-        <w:rPr>
-          <w:rStyle w:val="NormalTok"/>
-        </w:rPr>
-        <w:t xml:space="preserve">gender_data_final </w:t>
-      </w:r>
-      <w:r>
-        <w:rPr>
-          <w:rStyle w:val="OtherTok"/>
-        </w:rPr>
-        <w:t xml:space="preserve">&lt;-</w:t>
-      </w:r>
-      <w:r>
-        <w:rPr>
-          <w:rStyle w:val="NormalTok"/>
-        </w:rPr>
-        <w:t xml:space="preserve"> </w:t>
-      </w:r>
-      <w:r>
-        <w:br/>
-      </w:r>
-      <w:r>
-        <w:rPr>
-          <w:rStyle w:val="NormalTok"/>
-        </w:rPr>
-        <w:t xml:space="preserve">  gender_data_filtered </w:t>
-      </w:r>
-      <w:r>
-        <w:rPr>
-          <w:rStyle w:val="SpecialCharTok"/>
-        </w:rPr>
-        <w:t xml:space="preserve">%&gt;%</w:t>
-      </w:r>
-      <w:r>
-        <w:br/>
-      </w:r>
-      <w:r>
-        <w:rPr>
-          <w:rStyle w:val="NormalTok"/>
-        </w:rPr>
-        <w:t xml:space="preserve">  </w:t>
-      </w:r>
-      <w:r>
-        <w:rPr>
-          <w:rStyle w:val="FunctionTok"/>
-        </w:rPr>
-        <w:t xml:space="preserve">select</w:t>
-      </w:r>
-      <w:r>
-        <w:rPr>
-          <w:rStyle w:val="NormalTok"/>
-        </w:rPr>
-        <w:t xml:space="preserve">(</w:t>
-      </w:r>
-      <w:r>
-        <w:rPr>
-          <w:rStyle w:val="SpecialCharTok"/>
-        </w:rPr>
-        <w:t xml:space="preserve">!</w:t>
-      </w:r>
-      <w:r>
-        <w:rPr>
-          <w:rStyle w:val="FunctionTok"/>
-        </w:rPr>
-        <w:t xml:space="preserve">starts_with</w:t>
-      </w:r>
-      <w:r>
-        <w:rPr>
-          <w:rStyle w:val="NormalTok"/>
-        </w:rPr>
-        <w:t xml:space="preserve">(phrases))</w:t>
-      </w:r>
-      <w:r>
-        <w:br/>
-      </w:r>
-      <w:r>
-        <w:br/>
-      </w:r>
-      <w:r>
-        <w:rPr>
-          <w:rStyle w:val="CommentTok"/>
-        </w:rPr>
-        <w:t xml:space="preserve"># we'll also generate a couple of variables for future use</w:t>
-      </w:r>
-      <w:r>
-        <w:br/>
-      </w:r>
-      <w:r>
-        <w:br/>
-      </w:r>
-      <w:r>
-        <w:rPr>
-          <w:rStyle w:val="NormalTok"/>
-        </w:rPr>
-        <w:t xml:space="preserve">gender_data_final</w:t>
-      </w:r>
-      <w:r>
-        <w:rPr>
-          <w:rStyle w:val="SpecialCharTok"/>
-        </w:rPr>
-        <w:t xml:space="preserve">$</w:t>
-      </w:r>
-      <w:r>
-        <w:rPr>
-          <w:rStyle w:val="NormalTok"/>
-        </w:rPr>
-        <w:t xml:space="preserve">female_high_labor </w:t>
-      </w:r>
-      <w:r>
-        <w:rPr>
-          <w:rStyle w:val="OtherTok"/>
-        </w:rPr>
-        <w:t xml:space="preserve">&lt;-</w:t>
-      </w:r>
-      <w:r>
-        <w:rPr>
-          <w:rStyle w:val="NormalTok"/>
-        </w:rPr>
-        <w:t xml:space="preserve"> gender_data_final</w:t>
-      </w:r>
-      <w:r>
-        <w:rPr>
-          <w:rStyle w:val="SpecialCharTok"/>
-        </w:rPr>
-        <w:t xml:space="preserve">$</w:t>
-      </w:r>
-      <w:r>
-        <w:rPr>
-          <w:rStyle w:val="StringTok"/>
-        </w:rPr>
-        <w:t xml:space="preserve">`</w:t>
-      </w:r>
-      <w:r>
-        <w:rPr>
-          <w:rStyle w:val="AttributeTok"/>
-        </w:rPr>
-        <w:t xml:space="preserve">Labor force participation rate, female (% of female population ages 15-64) (modeled ILO estimate)</w:t>
-      </w:r>
-      <w:r>
-        <w:rPr>
-          <w:rStyle w:val="StringTok"/>
-        </w:rPr>
-        <w:t xml:space="preserve">`</w:t>
-      </w:r>
-      <w:r>
-        <w:rPr>
-          <w:rStyle w:val="SpecialCharTok"/>
-        </w:rPr>
-        <w:t xml:space="preserve">&gt;</w:t>
-      </w:r>
-      <w:r>
-        <w:rPr>
-          <w:rStyle w:val="DecValTok"/>
-        </w:rPr>
-        <w:t xml:space="preserve">70</w:t>
-      </w:r>
-      <w:r>
-        <w:br/>
-      </w:r>
-      <w:r>
-        <w:rPr>
-          <w:rStyle w:val="NormalTok"/>
-        </w:rPr>
-        <w:t xml:space="preserve">gender_data_final</w:t>
-      </w:r>
-      <w:r>
-        <w:rPr>
-          <w:rStyle w:val="SpecialCharTok"/>
-        </w:rPr>
-        <w:t xml:space="preserve">$</w:t>
-      </w:r>
-      <w:r>
-        <w:rPr>
-          <w:rStyle w:val="NormalTok"/>
-        </w:rPr>
-        <w:t xml:space="preserve">male_high_labor </w:t>
-      </w:r>
-      <w:r>
-        <w:rPr>
-          <w:rStyle w:val="OtherTok"/>
-        </w:rPr>
-        <w:t xml:space="preserve">&lt;-</w:t>
-      </w:r>
-      <w:r>
-        <w:rPr>
-          <w:rStyle w:val="NormalTok"/>
-        </w:rPr>
-        <w:t xml:space="preserve"> gender_data_final</w:t>
-      </w:r>
-      <w:r>
-        <w:rPr>
-          <w:rStyle w:val="SpecialCharTok"/>
-        </w:rPr>
-        <w:t xml:space="preserve">$</w:t>
-      </w:r>
-      <w:r>
-        <w:rPr>
-          <w:rStyle w:val="StringTok"/>
-        </w:rPr>
-        <w:t xml:space="preserve">`</w:t>
-      </w:r>
-      <w:r>
-        <w:rPr>
-          <w:rStyle w:val="AttributeTok"/>
-        </w:rPr>
-        <w:t xml:space="preserve">Labor force participation rate, male (% of male population ages 15-64) (modeled ILO estimate)</w:t>
-      </w:r>
-      <w:r>
-        <w:rPr>
-          <w:rStyle w:val="StringTok"/>
-        </w:rPr>
-        <w:t xml:space="preserve">`</w:t>
-      </w:r>
-      <w:r>
-        <w:rPr>
-          <w:rStyle w:val="SpecialCharTok"/>
-        </w:rPr>
-        <w:t xml:space="preserve">&gt;</w:t>
-      </w:r>
-      <w:r>
-        <w:rPr>
-          <w:rStyle w:val="DecValTok"/>
-        </w:rPr>
-        <w:t xml:space="preserve">70</w:t>
-      </w:r>
-      <w:r>
-        <w:rPr>
-          <w:rStyle w:val="NormalTok"/>
-        </w:rPr>
-        <w:t xml:space="preserve"> </w:t>
-      </w:r>
-      <w:r>
-        <w:br/>
-      </w:r>
-      <w:r>
-        <w:br/>
-      </w:r>
-      <w:r>
-        <w:rPr>
-          <w:rStyle w:val="FunctionTok"/>
-        </w:rPr>
-        <w:t xml:space="preserve">attach</w:t>
-      </w:r>
-      <w:r>
-        <w:rPr>
-          <w:rStyle w:val="NormalTok"/>
-        </w:rPr>
-        <w:t xml:space="preserve">(gender_data_final)</w:t>
-      </w:r>
     </w:p>
     <w:p>
       <w:pPr>
@@ -2356,7 +2710,7 @@
       <w:r>
         <w:t xml:space="preserve"> </w:t>
       </w:r>
-      <w:hyperlink r:id="rId32">
+      <w:hyperlink r:id="rId21">
         <w:r>
           <w:rPr>
             <w:rStyle w:val="Hyperlink"/>
@@ -2384,9 +2738,9 @@
         <w:t xml:space="preserve">Note that this is just for the purposes of demonstration, and not a serious investigation into these important research issues.</w:t>
       </w:r>
     </w:p>
-    <w:bookmarkEnd w:id="33"/>
-    <w:bookmarkEnd w:id="34"/>
-    <w:bookmarkStart w:id="57" w:name="statistical-tests"/>
+    <w:bookmarkEnd w:id="22"/>
+    <w:bookmarkEnd w:id="23"/>
+    <w:bookmarkStart w:id="46" w:name="statistical-tests"/>
     <w:p>
       <w:pPr>
         <w:pStyle w:val="Heading1"/>
@@ -2395,7 +2749,7 @@
         <w:t xml:space="preserve">3. Statistical Tests</w:t>
       </w:r>
     </w:p>
-    <w:bookmarkStart w:id="37" w:name="t-test"/>
+    <w:bookmarkStart w:id="26" w:name="t-test"/>
     <w:p>
       <w:pPr>
         <w:pStyle w:val="Heading2"/>
@@ -2427,7 +2781,7 @@
       <w:r>
         <w:t xml:space="preserve"> </w:t>
       </w:r>
-      <w:hyperlink r:id="rId35">
+      <w:hyperlink r:id="rId24">
         <w:r>
           <w:rPr>
             <w:rStyle w:val="Hyperlink"/>
@@ -2561,7 +2915,7 @@
       <w:r>
         <w:t xml:space="preserve"> </w:t>
       </w:r>
-      <w:hyperlink r:id="rId36">
+      <w:hyperlink r:id="rId25">
         <w:r>
           <w:rPr>
             <w:rStyle w:val="Hyperlink"/>
@@ -2630,8 +2984,8 @@
         <w:t xml:space="preserve">-value cutoffs can be used.</w:t>
       </w:r>
     </w:p>
-    <w:bookmarkEnd w:id="37"/>
-    <w:bookmarkStart w:id="38" w:name="one-sample-t-test"/>
+    <w:bookmarkEnd w:id="26"/>
+    <w:bookmarkStart w:id="27" w:name="one-sample-t-test"/>
     <w:p>
       <w:pPr>
         <w:pStyle w:val="Heading2"/>
@@ -2732,7 +3086,7 @@
         <w:rPr>
           <w:rStyle w:val="VerbatimChar"/>
         </w:rPr>
-        <w:t xml:space="preserve">t = 12.855, df = 11, p-value = 5.714e-08</w:t>
+        <w:t xml:space="preserve">t = 10.8, df = 11, p-value = 3.41e-07</w:t>
       </w:r>
       <w:r>
         <w:br/>
@@ -2759,7 +3113,7 @@
         <w:rPr>
           <w:rStyle w:val="VerbatimChar"/>
         </w:rPr>
-        <w:t xml:space="preserve"> 49.41461 69.83056</w:t>
+        <w:t xml:space="preserve"> 45.67753 69.06147</w:t>
       </w:r>
       <w:r>
         <w:br/>
@@ -2786,7 +3140,7 @@
         <w:rPr>
           <w:rStyle w:val="VerbatimChar"/>
         </w:rPr>
-        <w:t xml:space="preserve"> 59.62258 </w:t>
+        <w:t xml:space="preserve">  57.3695 </w:t>
       </w:r>
     </w:p>
     <w:p>
@@ -2888,7 +3242,7 @@
         <w:rPr>
           <w:rStyle w:val="VerbatimChar"/>
         </w:rPr>
-        <w:t xml:space="preserve">t = 1.569, df = 11, p-value = 0.1449</w:t>
+        <w:t xml:space="preserve">t = 1.7189, df = 11, p-value = 0.1136</w:t>
       </w:r>
       <w:r>
         <w:br/>
@@ -2915,7 +3269,7 @@
         <w:rPr>
           <w:rStyle w:val="VerbatimChar"/>
         </w:rPr>
-        <w:t xml:space="preserve"> 67.77376 83.28024</w:t>
+        <w:t xml:space="preserve"> 68.41972 82.84895</w:t>
       </w:r>
       <w:r>
         <w:br/>
@@ -2942,7 +3296,7 @@
         <w:rPr>
           <w:rStyle w:val="VerbatimChar"/>
         </w:rPr>
-        <w:t xml:space="preserve">   75.527 </w:t>
+        <w:t xml:space="preserve"> 75.63433 </w:t>
       </w:r>
     </w:p>
     <w:p>
@@ -2975,7 +3329,7 @@
         </m:r>
       </m:oMath>
       <w:r>
-        <w:t xml:space="preserve">&gt;.05 and a 95% confidence interval of (67,83), it is</w:t>
+        <w:t xml:space="preserve">&gt;.05 and a 95% confidence interval of (68,83), it is</w:t>
       </w:r>
       <w:r>
         <w:t xml:space="preserve"> </w:t>
@@ -3029,8 +3383,8 @@
         <w:t xml:space="preserve">?t.test</w:t>
       </w:r>
     </w:p>
-    <w:bookmarkEnd w:id="38"/>
-    <w:bookmarkStart w:id="40" w:name="paired-t-test"/>
+    <w:bookmarkEnd w:id="27"/>
+    <w:bookmarkStart w:id="29" w:name="paired-t-test"/>
     <w:p>
       <w:pPr>
         <w:pStyle w:val="Heading2"/>
@@ -3049,7 +3403,7 @@
       <w:r>
         <w:t xml:space="preserve"> </w:t>
       </w:r>
-      <w:hyperlink r:id="rId39">
+      <w:hyperlink r:id="rId28">
         <w:r>
           <w:rPr>
             <w:rStyle w:val="Hyperlink"/>
@@ -3206,7 +3560,7 @@
         <w:rPr>
           <w:rStyle w:val="VerbatimChar"/>
         </w:rPr>
-        <w:t xml:space="preserve">t = -3.9943, df = 11, p-value = 0.002106</w:t>
+        <w:t xml:space="preserve">t = -4.5938, df = 11, p-value = 0.0007727</w:t>
       </w:r>
       <w:r>
         <w:br/>
@@ -3233,7 +3587,7 @@
         <w:rPr>
           <w:rStyle w:val="VerbatimChar"/>
         </w:rPr>
-        <w:t xml:space="preserve"> -24.66817  -7.14066</w:t>
+        <w:t xml:space="preserve"> -27.015916  -9.513751</w:t>
       </w:r>
       <w:r>
         <w:br/>
@@ -3260,7 +3614,7 @@
         <w:rPr>
           <w:rStyle w:val="VerbatimChar"/>
         </w:rPr>
-        <w:t xml:space="preserve">      -15.90442 </w:t>
+        <w:t xml:space="preserve">      -18.26483 </w:t>
       </w:r>
     </w:p>
     <w:p>
@@ -3268,11 +3622,11 @@
         <w:pStyle w:val="FirstParagraph"/>
       </w:pPr>
       <w:r>
-        <w:t xml:space="preserve">There is a statistically significant difference, with the 95% confidence interval of female participation being between 7 and 25 percentage points lower than male rates, and a mean difference of -16 points.</w:t>
-      </w:r>
-    </w:p>
-    <w:bookmarkEnd w:id="40"/>
-    <w:bookmarkStart w:id="45" w:name="python-t-test"/>
+        <w:t xml:space="preserve">There is a statistically significant difference, with the 95% confidence interval of female participation being between 9 and 27 percentage points lower than male rates, and a mean difference of -18 points.</w:t>
+      </w:r>
+    </w:p>
+    <w:bookmarkEnd w:id="29"/>
+    <w:bookmarkStart w:id="34" w:name="python-t-test"/>
     <w:p>
       <w:pPr>
         <w:pStyle w:val="Heading2"/>
@@ -3347,7 +3701,7 @@
       <w:r>
         <w:t xml:space="preserve"> </w:t>
       </w:r>
-      <w:hyperlink r:id="rId41">
+      <w:hyperlink r:id="rId30">
         <w:r>
           <w:rPr>
             <w:rStyle w:val="Hyperlink"/>
@@ -3366,7 +3720,7 @@
       <w:r>
         <w:t xml:space="preserve"> </w:t>
       </w:r>
-      <w:hyperlink r:id="rId42">
+      <w:hyperlink r:id="rId31">
         <w:r>
           <w:rPr>
             <w:rStyle w:val="Hyperlink"/>
@@ -3401,7 +3755,7 @@
       <w:r>
         <w:t xml:space="preserve"> </w:t>
       </w:r>
-      <w:hyperlink r:id="rId43">
+      <w:hyperlink r:id="rId32">
         <w:r>
           <w:rPr>
             <w:rStyle w:val="Hyperlink"/>
@@ -3420,7 +3774,7 @@
       <w:r>
         <w:t xml:space="preserve"> </w:t>
       </w:r>
-      <w:hyperlink r:id="rId44">
+      <w:hyperlink r:id="rId33">
         <w:r>
           <w:rPr>
             <w:rStyle w:val="Hyperlink"/>
@@ -3721,7 +4075,7 @@
         <w:rPr>
           <w:rStyle w:val="VerbatimChar"/>
         </w:rPr>
-        <w:t xml:space="preserve">T statistic: -2.2375199095291447</w:t>
+        <w:t xml:space="preserve">T statistic: -2.377660717828251</w:t>
       </w:r>
     </w:p>
     <w:p>
@@ -3761,7 +4115,7 @@
         <w:rPr>
           <w:rStyle w:val="VerbatimChar"/>
         </w:rPr>
-        <w:t xml:space="preserve">P-value: 0.046904605502055996</w:t>
+        <w:t xml:space="preserve">P-value: 0.036652337841196724</w:t>
       </w:r>
     </w:p>
     <w:p>
@@ -3933,8 +4287,8 @@
         <w:t xml:space="preserve">Reject the null hypothesis; there is a significant difference between the sample mean and the hypothesized population mean.</w:t>
       </w:r>
     </w:p>
-    <w:bookmarkEnd w:id="45"/>
-    <w:bookmarkStart w:id="49" w:name="chi-squared-test-in-r-and-python"/>
+    <w:bookmarkEnd w:id="34"/>
+    <w:bookmarkStart w:id="38" w:name="chi-squared-test-in-r-and-python"/>
     <w:p>
       <w:pPr>
         <w:pStyle w:val="Heading2"/>
@@ -3965,7 +4319,7 @@
       <w:r>
         <w:t xml:space="preserve"> </w:t>
       </w:r>
-      <w:hyperlink r:id="rId46">
+      <w:hyperlink r:id="rId35">
         <w:r>
           <w:rPr>
             <w:rStyle w:val="Hyperlink"/>
@@ -3982,7 +4336,7 @@
       <w:r>
         <w:t xml:space="preserve"> </w:t>
       </w:r>
-      <w:hyperlink r:id="rId47">
+      <w:hyperlink r:id="rId36">
         <w:r>
           <w:rPr>
             <w:rStyle w:val="Hyperlink"/>
@@ -4007,7 +4361,7 @@
       <w:r>
         <w:t xml:space="preserve"> </w:t>
       </w:r>
-      <w:hyperlink r:id="rId48">
+      <w:hyperlink r:id="rId37">
         <w:r>
           <w:rPr>
             <w:rStyle w:val="Hyperlink"/>
@@ -4229,8 +4583,8 @@
         <w:t xml:space="preserve">statistically significant, probably due to the small size of the matrix.</w:t>
       </w:r>
     </w:p>
-    <w:bookmarkEnd w:id="49"/>
-    <w:bookmarkStart w:id="54" w:name="X2594c80556864044e29d234775608a0b3fb2fe6"/>
+    <w:bookmarkEnd w:id="38"/>
+    <w:bookmarkStart w:id="43" w:name="X2594c80556864044e29d234775608a0b3fb2fe6"/>
     <w:p>
       <w:pPr>
         <w:pStyle w:val="Heading2"/>
@@ -4255,7 +4609,7 @@
           <w:numId w:val="1001"/>
         </w:numPr>
       </w:pPr>
-      <w:hyperlink r:id="rId50">
+      <w:hyperlink r:id="rId39">
         <w:r>
           <w:rPr>
             <w:rStyle w:val="Hyperlink"/>
@@ -4272,7 +4626,7 @@
           <w:numId w:val="1001"/>
         </w:numPr>
       </w:pPr>
-      <w:hyperlink r:id="rId51">
+      <w:hyperlink r:id="rId40">
         <w:r>
           <w:rPr>
             <w:rStyle w:val="Hyperlink"/>
@@ -4295,7 +4649,7 @@
       <w:r>
         <w:t xml:space="preserve"> </w:t>
       </w:r>
-      <w:hyperlink r:id="rId52">
+      <w:hyperlink r:id="rId41">
         <w:r>
           <w:rPr>
             <w:rStyle w:val="Hyperlink"/>
@@ -4312,7 +4666,7 @@
       <w:r>
         <w:t xml:space="preserve"> </w:t>
       </w:r>
-      <w:hyperlink r:id="rId53">
+      <w:hyperlink r:id="rId42">
         <w:r>
           <w:rPr>
             <w:rStyle w:val="Hyperlink"/>
@@ -4337,8 +4691,8 @@
         <w:t xml:space="preserve">Rutgers-restricted</w:t>
       </w:r>
     </w:p>
-    <w:bookmarkEnd w:id="54"/>
-    <w:bookmarkStart w:id="56" w:name="distributions"/>
+    <w:bookmarkEnd w:id="43"/>
+    <w:bookmarkStart w:id="45" w:name="distributions"/>
     <w:p>
       <w:pPr>
         <w:pStyle w:val="Heading2"/>
@@ -4670,7 +5024,7 @@
         <w:rPr>
           <w:rStyle w:val="VerbatimChar"/>
         </w:rPr>
-        <w:t xml:space="preserve">[1] -0.3943388</w:t>
+        <w:t xml:space="preserve">[1] -0.7332273</w:t>
       </w:r>
     </w:p>
     <w:p>
@@ -4758,7 +5112,7 @@
         <w:rPr>
           <w:rStyle w:val="VerbatimChar"/>
         </w:rPr>
-        <w:t xml:space="preserve">[1] 101.42550  87.09571  80.35870 123.65201 104.13092</w:t>
+        <w:t xml:space="preserve">[1]  79.61781  62.45957  99.14707 101.89495 147.93884</w:t>
       </w:r>
     </w:p>
     <w:p>
@@ -4802,7 +5156,7 @@
       <w:r>
         <w:t xml:space="preserve"> </w:t>
       </w:r>
-      <w:hyperlink r:id="rId55">
+      <w:hyperlink r:id="rId44">
         <w:r>
           <w:rPr>
             <w:rStyle w:val="Hyperlink"/>
@@ -4817,9 +5171,9 @@
         <w:t xml:space="preserve">page.</w:t>
       </w:r>
     </w:p>
-    <w:bookmarkEnd w:id="56"/>
-    <w:bookmarkEnd w:id="57"/>
-    <w:bookmarkStart w:id="58" w:name="correlation"/>
+    <w:bookmarkEnd w:id="45"/>
+    <w:bookmarkEnd w:id="46"/>
+    <w:bookmarkStart w:id="47" w:name="correlation"/>
     <w:p>
       <w:pPr>
         <w:pStyle w:val="Heading1"/>
@@ -5018,7 +5372,7 @@
         <w:rPr>
           <w:rStyle w:val="VerbatimChar"/>
         </w:rPr>
-        <w:t xml:space="preserve">[1] -0.5703267</w:t>
+        <w:t xml:space="preserve">[1] -0.5614513</w:t>
       </w:r>
     </w:p>
     <w:p>
@@ -5142,7 +5496,7 @@
         <w:rPr>
           <w:rStyle w:val="VerbatimChar"/>
         </w:rPr>
-        <w:t xml:space="preserve">t = -2.1956, df = 10, p-value = 0.05283</w:t>
+        <w:t xml:space="preserve">t = -2.1456, df = 10, p-value = 0.05749</w:t>
       </w:r>
       <w:r>
         <w:br/>
@@ -5169,7 +5523,7 @@
         <w:rPr>
           <w:rStyle w:val="VerbatimChar"/>
         </w:rPr>
-        <w:t xml:space="preserve"> -0.862064717  0.005314307</w:t>
+        <w:t xml:space="preserve"> -0.85867315  0.01836915</w:t>
       </w:r>
       <w:r>
         <w:br/>
@@ -5196,11 +5550,11 @@
         <w:rPr>
           <w:rStyle w:val="VerbatimChar"/>
         </w:rPr>
-        <w:t xml:space="preserve">-0.5703267 </w:t>
-      </w:r>
-    </w:p>
-    <w:bookmarkEnd w:id="58"/>
-    <w:bookmarkStart w:id="84" w:name="regression"/>
+        <w:t xml:space="preserve">-0.5614513 </w:t>
+      </w:r>
+    </w:p>
+    <w:bookmarkEnd w:id="47"/>
+    <w:bookmarkStart w:id="73" w:name="regression"/>
     <w:p>
       <w:pPr>
         <w:pStyle w:val="Heading1"/>
@@ -5259,7 +5613,7 @@
         <w:t xml:space="preserve">variables (also called independent or predictor variables). Proper implementation of regression requires careful attention to the data and examination of the model fit, variable selection, and more. The quick and dirty approach below is simply designed to show R syntax in action.</w:t>
       </w:r>
     </w:p>
-    <w:bookmarkStart w:id="59" w:name="linear-regression"/>
+    <w:bookmarkStart w:id="48" w:name="linear-regression"/>
     <w:p>
       <w:pPr>
         <w:pStyle w:val="Heading2"/>
@@ -5416,7 +5770,7 @@
         <w:rPr>
           <w:rStyle w:val="VerbatimChar"/>
         </w:rPr>
-        <w:t xml:space="preserve">                           5.202e+01                             4.519e-04  </w:t>
+        <w:t xml:space="preserve">                           4.818e+01                             5.311e-04  </w:t>
       </w:r>
     </w:p>
     <w:p>
@@ -5579,7 +5933,7 @@
         <w:rPr>
           <w:rStyle w:val="VerbatimChar"/>
         </w:rPr>
-        <w:t xml:space="preserve">-19.565 -10.689   3.864   8.156  19.525 </w:t>
+        <w:t xml:space="preserve">-25.768 -12.012   1.565   9.759  21.553 </w:t>
       </w:r>
       <w:r>
         <w:br/>
@@ -5609,16 +5963,16 @@
         <w:rPr>
           <w:rStyle w:val="VerbatimChar"/>
         </w:rPr>
-        <w:t xml:space="preserve">(Intercept)                          5.202e+01  5.198e+00  10.007 1.58e-06 ***</w:t>
-      </w:r>
-      <w:r>
-        <w:br/>
-      </w:r>
-      <w:r>
-        <w:rPr>
-          <w:rStyle w:val="VerbatimChar"/>
-        </w:rPr>
-        <w:t xml:space="preserve">`GDP per capita (constant 2015 US$)` 4.519e-04  2.001e-04   2.258   0.0475 *  </w:t>
+        <w:t xml:space="preserve">(Intercept)                          4.818e+01  5.868e+00   8.212 9.36e-06 ***</w:t>
+      </w:r>
+      <w:r>
+        <w:br/>
+      </w:r>
+      <w:r>
+        <w:rPr>
+          <w:rStyle w:val="VerbatimChar"/>
+        </w:rPr>
+        <w:t xml:space="preserve">`GDP per capita (constant 2015 US$)` 5.311e-04  2.217e-04   2.395   0.0376 *  </w:t>
       </w:r>
       <w:r>
         <w:br/>
@@ -5648,25 +6002,25 @@
         <w:rPr>
           <w:rStyle w:val="VerbatimChar"/>
         </w:rPr>
-        <w:t xml:space="preserve">Residual standard error: 13.71 on 10 degrees of freedom</w:t>
-      </w:r>
-      <w:r>
-        <w:br/>
-      </w:r>
-      <w:r>
-        <w:rPr>
-          <w:rStyle w:val="VerbatimChar"/>
-        </w:rPr>
-        <w:t xml:space="preserve">Multiple R-squared:  0.3378,    Adjusted R-squared:  0.2715 </w:t>
-      </w:r>
-      <w:r>
-        <w:br/>
-      </w:r>
-      <w:r>
-        <w:rPr>
-          <w:rStyle w:val="VerbatimChar"/>
-        </w:rPr>
-        <w:t xml:space="preserve">F-statistic:   5.1 on 1 and 10 DF,  p-value: 0.0475</w:t>
+        <w:t xml:space="preserve">Residual standard error: 15.38 on 10 degrees of freedom</w:t>
+      </w:r>
+      <w:r>
+        <w:br/>
+      </w:r>
+      <w:r>
+        <w:rPr>
+          <w:rStyle w:val="VerbatimChar"/>
+        </w:rPr>
+        <w:t xml:space="preserve">Multiple R-squared:  0.3646,    Adjusted R-squared:  0.301 </w:t>
+      </w:r>
+      <w:r>
+        <w:br/>
+      </w:r>
+      <w:r>
+        <w:rPr>
+          <w:rStyle w:val="VerbatimChar"/>
+        </w:rPr>
+        <w:t xml:space="preserve">F-statistic: 5.737 on 1 and 10 DF,  p-value: 0.03762</w:t>
       </w:r>
     </w:p>
     <w:p>
@@ -5841,7 +6195,7 @@
         <w:rPr>
           <w:rStyle w:val="VerbatimChar"/>
         </w:rPr>
-        <w:t xml:space="preserve">-28.406  -2.038   2.802   4.065  25.988 </w:t>
+        <w:t xml:space="preserve">-25.120  -4.875   4.035   5.752  30.035 </w:t>
       </w:r>
       <w:r>
         <w:br/>
@@ -5871,16 +6225,16 @@
         <w:rPr>
           <w:rStyle w:val="VerbatimChar"/>
         </w:rPr>
-        <w:t xml:space="preserve">(Intercept)                                  83.269     11.438   7.280 2.66e-05</w:t>
-      </w:r>
-      <w:r>
-        <w:br/>
-      </w:r>
-      <w:r>
-        <w:rPr>
-          <w:rStyle w:val="VerbatimChar"/>
-        </w:rPr>
-        <w:t xml:space="preserve">`Fertility rate, total (births per woman)`  -10.804      4.898  -2.206   0.0519</w:t>
+        <w:t xml:space="preserve">(Intercept)                                  86.646     12.635   6.857 4.42e-05</w:t>
+      </w:r>
+      <w:r>
+        <w:br/>
+      </w:r>
+      <w:r>
+        <w:rPr>
+          <w:rStyle w:val="VerbatimChar"/>
+        </w:rPr>
+        <w:t xml:space="preserve">`Fertility rate, total (births per woman)`  -13.619      5.511  -2.471    0.033</w:t>
       </w:r>
       <w:r>
         <w:br/>
@@ -5907,7 +6261,7 @@
         <w:rPr>
           <w:rStyle w:val="VerbatimChar"/>
         </w:rPr>
-        <w:t xml:space="preserve">`Fertility rate, total (births per woman)` .  </w:t>
+        <w:t xml:space="preserve">`Fertility rate, total (births per woman)` *  </w:t>
       </w:r>
       <w:r>
         <w:br/>
@@ -5937,25 +6291,25 @@
         <w:rPr>
           <w:rStyle w:val="VerbatimChar"/>
         </w:rPr>
-        <w:t xml:space="preserve">Residual standard error: 13.82 on 10 degrees of freedom</w:t>
-      </w:r>
-      <w:r>
-        <w:br/>
-      </w:r>
-      <w:r>
-        <w:rPr>
-          <w:rStyle w:val="VerbatimChar"/>
-        </w:rPr>
-        <w:t xml:space="preserve">Multiple R-squared:  0.3273,    Adjusted R-squared:   0.26 </w:t>
-      </w:r>
-      <w:r>
-        <w:br/>
-      </w:r>
-      <w:r>
-        <w:rPr>
-          <w:rStyle w:val="VerbatimChar"/>
-        </w:rPr>
-        <w:t xml:space="preserve">F-statistic: 4.865 on 1 and 10 DF,  p-value: 0.05193</w:t>
+        <w:t xml:space="preserve">Residual standard error: 15.21 on 10 degrees of freedom</w:t>
+      </w:r>
+      <w:r>
+        <w:br/>
+      </w:r>
+      <w:r>
+        <w:rPr>
+          <w:rStyle w:val="VerbatimChar"/>
+        </w:rPr>
+        <w:t xml:space="preserve">Multiple R-squared:  0.3791,    Adjusted R-squared:  0.317 </w:t>
+      </w:r>
+      <w:r>
+        <w:br/>
+      </w:r>
+      <w:r>
+        <w:rPr>
+          <w:rStyle w:val="VerbatimChar"/>
+        </w:rPr>
+        <w:t xml:space="preserve">F-statistic: 6.106 on 1 and 10 DF,  p-value: 0.03305</w:t>
       </w:r>
     </w:p>
     <w:p>
@@ -6076,16 +6430,16 @@
         <w:rPr>
           <w:rStyle w:val="VerbatimChar"/>
         </w:rPr>
-        <w:t xml:space="preserve">    Min      1Q  Median      3Q     Max </w:t>
-      </w:r>
-      <w:r>
-        <w:br/>
-      </w:r>
-      <w:r>
-        <w:rPr>
-          <w:rStyle w:val="VerbatimChar"/>
-        </w:rPr>
-        <w:t xml:space="preserve">-1.2918 -0.5261  0.1835  0.5335  1.0035 </w:t>
+        <w:t xml:space="preserve">     Min       1Q   Median       3Q      Max </w:t>
+      </w:r>
+      <w:r>
+        <w:br/>
+      </w:r>
+      <w:r>
+        <w:rPr>
+          <w:rStyle w:val="VerbatimChar"/>
+        </w:rPr>
+        <w:t xml:space="preserve">-1.22999 -0.52528  0.08167  0.54595  1.05010 </w:t>
       </w:r>
       <w:r>
         <w:br/>
@@ -6115,16 +6469,16 @@
         <w:rPr>
           <w:rStyle w:val="VerbatimChar"/>
         </w:rPr>
-        <w:t xml:space="preserve">(Intercept)                           2.584e+00  2.778e-01   9.301 3.08e-06 ***</w:t>
-      </w:r>
-      <w:r>
-        <w:br/>
-      </w:r>
-      <w:r>
-        <w:rPr>
-          <w:rStyle w:val="VerbatimChar"/>
-        </w:rPr>
-        <w:t xml:space="preserve">`GDP per capita (constant 2015 US$)` -2.348e-05  1.070e-05  -2.196   0.0528 .  </w:t>
+        <w:t xml:space="preserve">(Intercept)                           2.536e+00  2.754e-01   9.208 3.37e-06 ***</w:t>
+      </w:r>
+      <w:r>
+        <w:br/>
+      </w:r>
+      <w:r>
+        <w:rPr>
+          <w:rStyle w:val="VerbatimChar"/>
+        </w:rPr>
+        <w:t xml:space="preserve">`GDP per capita (constant 2015 US$)` -2.233e-05  1.041e-05  -2.146   0.0575 .  </w:t>
       </w:r>
       <w:r>
         <w:br/>
@@ -6154,25 +6508,25 @@
         <w:rPr>
           <w:rStyle w:val="VerbatimChar"/>
         </w:rPr>
-        <w:t xml:space="preserve">Residual standard error: 0.733 on 10 degrees of freedom</w:t>
-      </w:r>
-      <w:r>
-        <w:br/>
-      </w:r>
-      <w:r>
-        <w:rPr>
-          <w:rStyle w:val="VerbatimChar"/>
-        </w:rPr>
-        <w:t xml:space="preserve">Multiple R-squared:  0.3253,    Adjusted R-squared:  0.2578 </w:t>
-      </w:r>
-      <w:r>
-        <w:br/>
-      </w:r>
-      <w:r>
-        <w:rPr>
-          <w:rStyle w:val="VerbatimChar"/>
-        </w:rPr>
-        <w:t xml:space="preserve">F-statistic: 4.821 on 1 and 10 DF,  p-value: 0.05283</w:t>
+        <w:t xml:space="preserve">Residual standard error: 0.7221 on 10 degrees of freedom</w:t>
+      </w:r>
+      <w:r>
+        <w:br/>
+      </w:r>
+      <w:r>
+        <w:rPr>
+          <w:rStyle w:val="VerbatimChar"/>
+        </w:rPr>
+        <w:t xml:space="preserve">Multiple R-squared:  0.3152,    Adjusted R-squared:  0.2468 </w:t>
+      </w:r>
+      <w:r>
+        <w:br/>
+      </w:r>
+      <w:r>
+        <w:rPr>
+          <w:rStyle w:val="VerbatimChar"/>
+        </w:rPr>
+        <w:t xml:space="preserve">F-statistic: 4.603 on 1 and 10 DF,  p-value: 0.05749</w:t>
       </w:r>
     </w:p>
     <w:p>
@@ -6180,7 +6534,7 @@
         <w:pStyle w:val="FirstParagraph"/>
       </w:pPr>
       <w:r>
-        <w:t xml:space="preserve">Here our p-values are significant at the 10% level but not the 5% level. Also note that if want to run the regression without an intercept, we can just add a -1 to the equation.</w:t>
+        <w:t xml:space="preserve">In the last case, our p-values are significant at the 10% level but not the 5% level. Also note that if want to run the regression without an intercept, we can just add a -1 to the equation.</w:t>
       </w:r>
     </w:p>
     <w:p>
@@ -6331,7 +6685,7 @@
         <w:rPr>
           <w:rStyle w:val="VerbatimChar"/>
         </w:rPr>
-        <w:t xml:space="preserve">-45.89  24.87  37.89  50.74  56.68 </w:t>
+        <w:t xml:space="preserve">-46.11  18.26  34.37  47.50  55.61 </w:t>
       </w:r>
       <w:r>
         <w:br/>
@@ -6361,7 +6715,7 @@
         <w:rPr>
           <w:rStyle w:val="VerbatimChar"/>
         </w:rPr>
-        <w:t xml:space="preserve">`GDP per capita (constant 2015 US$)` 0.0017497  0.0004822   3.628  0.00397 **</w:t>
+        <w:t xml:space="preserve">`GDP per capita (constant 2015 US$)` 0.0017209  0.0004452   3.865  0.00263 **</w:t>
       </w:r>
       <w:r>
         <w:br/>
@@ -6391,29 +6745,29 @@
         <w:rPr>
           <w:rStyle w:val="VerbatimChar"/>
         </w:rPr>
-        <w:t xml:space="preserve">Residual standard error: 43.39 on 11 degrees of freedom</w:t>
-      </w:r>
-      <w:r>
-        <w:br/>
-      </w:r>
-      <w:r>
-        <w:rPr>
-          <w:rStyle w:val="VerbatimChar"/>
-        </w:rPr>
-        <w:t xml:space="preserve">Multiple R-squared:  0.5448,    Adjusted R-squared:  0.5034 </w:t>
-      </w:r>
-      <w:r>
-        <w:br/>
-      </w:r>
-      <w:r>
-        <w:rPr>
-          <w:rStyle w:val="VerbatimChar"/>
-        </w:rPr>
-        <w:t xml:space="preserve">F-statistic: 13.16 on 1 and 11 DF,  p-value: 0.003969</w:t>
-      </w:r>
-    </w:p>
-    <w:bookmarkEnd w:id="59"/>
-    <w:bookmarkStart w:id="60" w:name="multiple-regression"/>
+        <w:t xml:space="preserve">Residual standard error: 40.82 on 11 degrees of freedom</w:t>
+      </w:r>
+      <w:r>
+        <w:br/>
+      </w:r>
+      <w:r>
+        <w:rPr>
+          <w:rStyle w:val="VerbatimChar"/>
+        </w:rPr>
+        <w:t xml:space="preserve">Multiple R-squared:  0.576, Adjusted R-squared:  0.5374 </w:t>
+      </w:r>
+      <w:r>
+        <w:br/>
+      </w:r>
+      <w:r>
+        <w:rPr>
+          <w:rStyle w:val="VerbatimChar"/>
+        </w:rPr>
+        <w:t xml:space="preserve">F-statistic: 14.94 on 1 and 11 DF,  p-value: 0.002629</w:t>
+      </w:r>
+    </w:p>
+    <w:bookmarkEnd w:id="48"/>
+    <w:bookmarkStart w:id="49" w:name="multiple-regression"/>
     <w:p>
       <w:pPr>
         <w:pStyle w:val="Heading2"/>
@@ -6603,7 +6957,7 @@
         <w:rPr>
           <w:rStyle w:val="VerbatimChar"/>
         </w:rPr>
-        <w:t xml:space="preserve">-23.259  -4.659   3.096   5.191  24.219 </w:t>
+        <w:t xml:space="preserve">-21.000  -8.665   2.962   4.951  27.928 </w:t>
       </w:r>
       <w:r>
         <w:br/>
@@ -6633,25 +6987,25 @@
         <w:rPr>
           <w:rStyle w:val="VerbatimChar"/>
         </w:rPr>
-        <w:t xml:space="preserve">(Intercept)                                69.4191018 15.8793413   4.372</w:t>
-      </w:r>
-      <w:r>
-        <w:br/>
-      </w:r>
-      <w:r>
-        <w:rPr>
-          <w:rStyle w:val="VerbatimChar"/>
-        </w:rPr>
-        <w:t xml:space="preserve">`Fertility rate, total (births per woman)` -6.7351397  5.8180954  -1.158</w:t>
-      </w:r>
-      <w:r>
-        <w:br/>
-      </w:r>
-      <w:r>
-        <w:rPr>
-          <w:rStyle w:val="VerbatimChar"/>
-        </w:rPr>
-        <w:t xml:space="preserve">`GDP per capita (constant 2015 US$)`        0.0002937  0.0002396   1.226</w:t>
+        <w:t xml:space="preserve">(Intercept)                                70.8498460 17.2864616   4.099</w:t>
+      </w:r>
+      <w:r>
+        <w:br/>
+      </w:r>
+      <w:r>
+        <w:rPr>
+          <w:rStyle w:val="VerbatimChar"/>
+        </w:rPr>
+        <w:t xml:space="preserve">`Fertility rate, total (births per woman)` -8.9381653  6.4471824  -1.386</w:t>
+      </w:r>
+      <w:r>
+        <w:br/>
+      </w:r>
+      <w:r>
+        <w:rPr>
+          <w:rStyle w:val="VerbatimChar"/>
+        </w:rPr>
+        <w:t xml:space="preserve">`GDP per capita (constant 2015 US$)`        0.0003315  0.0002564   1.293</w:t>
       </w:r>
       <w:r>
         <w:br/>
@@ -6669,25 +7023,25 @@
         <w:rPr>
           <w:rStyle w:val="VerbatimChar"/>
         </w:rPr>
-        <w:t xml:space="preserve">(Intercept)                                 0.00179 **</w:t>
-      </w:r>
-      <w:r>
-        <w:br/>
-      </w:r>
-      <w:r>
-        <w:rPr>
-          <w:rStyle w:val="VerbatimChar"/>
-        </w:rPr>
-        <w:t xml:space="preserve">`Fertility rate, total (births per woman)`  0.27682   </w:t>
-      </w:r>
-      <w:r>
-        <w:br/>
-      </w:r>
-      <w:r>
-        <w:rPr>
-          <w:rStyle w:val="VerbatimChar"/>
-        </w:rPr>
-        <w:t xml:space="preserve">`GDP per capita (constant 2015 US$)`        0.25127   </w:t>
+        <w:t xml:space="preserve">(Intercept)                                 0.00268 **</w:t>
+      </w:r>
+      <w:r>
+        <w:br/>
+      </w:r>
+      <w:r>
+        <w:rPr>
+          <w:rStyle w:val="VerbatimChar"/>
+        </w:rPr>
+        <w:t xml:space="preserve">`Fertility rate, total (births per woman)`  0.19901   </w:t>
+      </w:r>
+      <w:r>
+        <w:br/>
+      </w:r>
+      <w:r>
+        <w:rPr>
+          <w:rStyle w:val="VerbatimChar"/>
+        </w:rPr>
+        <w:t xml:space="preserve">`GDP per capita (constant 2015 US$)`        0.22818   </w:t>
       </w:r>
       <w:r>
         <w:br/>
@@ -6717,29 +7071,29 @@
         <w:rPr>
           <w:rStyle w:val="VerbatimChar"/>
         </w:rPr>
-        <w:t xml:space="preserve">Residual standard error: 13.49 on 9 degrees of freedom</w:t>
-      </w:r>
-      <w:r>
-        <w:br/>
-      </w:r>
-      <w:r>
-        <w:rPr>
-          <w:rStyle w:val="VerbatimChar"/>
-        </w:rPr>
-        <w:t xml:space="preserve">Multiple R-squared:  0.4236,    Adjusted R-squared:  0.2955 </w:t>
-      </w:r>
-      <w:r>
-        <w:br/>
-      </w:r>
-      <w:r>
-        <w:rPr>
-          <w:rStyle w:val="VerbatimChar"/>
-        </w:rPr>
-        <w:t xml:space="preserve">F-statistic: 3.307 on 2 and 9 DF,  p-value: 0.08381</w:t>
-      </w:r>
-    </w:p>
-    <w:bookmarkEnd w:id="60"/>
-    <w:bookmarkStart w:id="61" w:name="stored-regression-objects"/>
+        <w:t xml:space="preserve">Residual standard error: 14.72 on 9 degrees of freedom</w:t>
+      </w:r>
+      <w:r>
+        <w:br/>
+      </w:r>
+      <w:r>
+        <w:rPr>
+          <w:rStyle w:val="VerbatimChar"/>
+        </w:rPr>
+        <w:t xml:space="preserve">Multiple R-squared:  0.4764,    Adjusted R-squared:   0.36 </w:t>
+      </w:r>
+      <w:r>
+        <w:br/>
+      </w:r>
+      <w:r>
+        <w:rPr>
+          <w:rStyle w:val="VerbatimChar"/>
+        </w:rPr>
+        <w:t xml:space="preserve">F-statistic: 4.094 on 2 and 9 DF,  p-value: 0.05439</w:t>
+      </w:r>
+    </w:p>
+    <w:bookmarkEnd w:id="49"/>
+    <w:bookmarkStart w:id="50" w:name="stored-regression-objects"/>
     <w:p>
       <w:pPr>
         <w:pStyle w:val="Heading2"/>
@@ -6932,34 +7286,34 @@
         <w:rPr>
           <w:rStyle w:val="VerbatimChar"/>
         </w:rPr>
-        <w:t xml:space="preserve">         1          2          3          4          5          6          7 </w:t>
-      </w:r>
-      <w:r>
-        <w:br/>
-      </w:r>
-      <w:r>
-        <w:rPr>
-          <w:rStyle w:val="VerbatimChar"/>
-        </w:rPr>
-        <w:t xml:space="preserve">  3.582201   2.887776 -23.259257   3.303619  24.218814   5.172425   5.244711 </w:t>
-      </w:r>
-      <w:r>
-        <w:br/>
-      </w:r>
-      <w:r>
-        <w:rPr>
-          <w:rStyle w:val="VerbatimChar"/>
-        </w:rPr>
-        <w:t xml:space="preserve">         8          9         10         11         12 </w:t>
-      </w:r>
-      <w:r>
-        <w:br/>
-      </w:r>
-      <w:r>
-        <w:rPr>
-          <w:rStyle w:val="VerbatimChar"/>
-        </w:rPr>
-        <w:t xml:space="preserve">  8.434951 -16.056077  -1.281381  -9.053288  -3.194494 </w:t>
+        <w:t xml:space="preserve">          1           2           3           4           5           6 </w:t>
+      </w:r>
+      <w:r>
+        <w:br/>
+      </w:r>
+      <w:r>
+        <w:rPr>
+          <w:rStyle w:val="VerbatimChar"/>
+        </w:rPr>
+        <w:t xml:space="preserve">  3.6794737   2.6116621 -19.2917811   3.3116222  27.9277592  -0.3485412 </w:t>
+      </w:r>
+      <w:r>
+        <w:br/>
+      </w:r>
+      <w:r>
+        <w:rPr>
+          <w:rStyle w:val="VerbatimChar"/>
+        </w:rPr>
+        <w:t xml:space="preserve">          7           8           9          10          11          12 </w:t>
+      </w:r>
+      <w:r>
+        <w:br/>
+      </w:r>
+      <w:r>
+        <w:rPr>
+          <w:rStyle w:val="VerbatimChar"/>
+        </w:rPr>
+        <w:t xml:space="preserve">  6.1817641  10.2952157 -20.9996187  -8.3765606  -9.5311477   4.5401524 </w:t>
       </w:r>
     </w:p>
     <w:p>
@@ -7045,7 +7399,7 @@
         <w:rPr>
           <w:rStyle w:val="VerbatimChar"/>
         </w:rPr>
-        <w:t xml:space="preserve">66.35780 72.98422 56.78426 72.19138 52.49719 51.61558 52.54329 63.02505 </w:t>
+        <w:t xml:space="preserve">66.14453 73.28934 54.09778 73.16038 48.11424 48.08254 50.03824 61.85278 </w:t>
       </w:r>
       <w:r>
         <w:br/>
@@ -7063,7 +7417,7 @@
         <w:rPr>
           <w:rStyle w:val="VerbatimChar"/>
         </w:rPr>
-        <w:t xml:space="preserve">49.14208 53.61638 77.77329 46.94049 </w:t>
+        <w:t xml:space="preserve">44.20962 49.79356 78.47515 41.17585 </w:t>
       </w:r>
     </w:p>
     <w:p>
@@ -7130,25 +7484,25 @@
         <w:rPr>
           <w:rStyle w:val="VerbatimChar"/>
         </w:rPr>
-        <w:t xml:space="preserve">`Fertility rate, total (births per woman)`  1  929.32  929.32  5.1104 0.05013 .</w:t>
-      </w:r>
-      <w:r>
-        <w:br/>
-      </w:r>
-      <w:r>
-        <w:rPr>
-          <w:rStyle w:val="VerbatimChar"/>
-        </w:rPr>
-        <w:t xml:space="preserve">`GDP per capita (constant 2015 US$)`        1  273.39  273.39  1.5034 0.25127  </w:t>
-      </w:r>
-      <w:r>
-        <w:br/>
-      </w:r>
-      <w:r>
-        <w:rPr>
-          <w:rStyle w:val="VerbatimChar"/>
-        </w:rPr>
-        <w:t xml:space="preserve">Residuals                                   9 1636.65  181.85                  </w:t>
+        <w:t xml:space="preserve">`Fertility rate, total (births per woman)`  1 1412.15 1412.15  6.5163 0.03106 *</w:t>
+      </w:r>
+      <w:r>
+        <w:br/>
+      </w:r>
+      <w:r>
+        <w:rPr>
+          <w:rStyle w:val="VerbatimChar"/>
+        </w:rPr>
+        <w:t xml:space="preserve">`GDP per capita (constant 2015 US$)`        1  362.37  362.37  1.6721 0.22818  </w:t>
+      </w:r>
+      <w:r>
+        <w:br/>
+      </w:r>
+      <w:r>
+        <w:rPr>
+          <w:rStyle w:val="VerbatimChar"/>
+        </w:rPr>
+        <w:t xml:space="preserve">Residuals                                   9 1950.39  216.71                  </w:t>
       </w:r>
       <w:r>
         <w:br/>
@@ -7169,8 +7523,8 @@
         <w:t xml:space="preserve">Signif. codes:  0 '***' 0.001 '**' 0.01 '*' 0.05 '.' 0.1 ' ' 1</w:t>
       </w:r>
     </w:p>
-    <w:bookmarkEnd w:id="61"/>
-    <w:bookmarkStart w:id="76" w:name="regression-diagnostics"/>
+    <w:bookmarkEnd w:id="50"/>
+    <w:bookmarkStart w:id="65" w:name="regression-diagnostics"/>
     <w:p>
       <w:pPr>
         <w:pStyle w:val="Heading2"/>
@@ -7207,7 +7561,7 @@
       <w:r>
         <w:t xml:space="preserve"> </w:t>
       </w:r>
-      <w:hyperlink r:id="rId62">
+      <w:hyperlink r:id="rId51">
         <w:r>
           <w:rPr>
             <w:rStyle w:val="Hyperlink"/>
@@ -7224,7 +7578,7 @@
       <w:r>
         <w:t xml:space="preserve"> </w:t>
       </w:r>
-      <w:hyperlink r:id="rId63">
+      <w:hyperlink r:id="rId52">
         <w:r>
           <w:rPr>
             <w:rStyle w:val="Hyperlink"/>
@@ -7417,7 +7771,7 @@
         <w:rPr>
           <w:rStyle w:val="VerbatimChar"/>
         </w:rPr>
-        <w:t xml:space="preserve">W = 0.93721, p-value = 0.4628</w:t>
+        <w:t xml:space="preserve">W = 0.93361, p-value = 0.4199</w:t>
       </w:r>
     </w:p>
     <w:p>
@@ -7493,7 +7847,7 @@
         <w:rPr>
           <w:rStyle w:val="VerbatimChar"/>
         </w:rPr>
-        <w:t xml:space="preserve">D = 0.58139, p-value = 0.0002217</w:t>
+        <w:t xml:space="preserve">D = 0.57883, p-value = 0.0002418</w:t>
       </w:r>
       <w:r>
         <w:br/>
@@ -7614,7 +7968,7 @@
         <w:rPr>
           <w:rStyle w:val="VerbatimChar"/>
         </w:rPr>
-        <w:t xml:space="preserve">D = 0.18069, p-value = 0.7658</w:t>
+        <w:t xml:space="preserve">D = 0.1639, p-value = 0.8533</w:t>
       </w:r>
       <w:r>
         <w:br/>
@@ -7686,18 +8040,18 @@
           <wp:inline>
             <wp:extent cx="4620126" cy="3696101"/>
             <wp:effectExtent b="0" l="0" r="0" t="0"/>
-            <wp:docPr descr="" title="" id="65" name="Picture"/>
+            <wp:docPr descr="" title="" id="54" name="Picture"/>
             <a:graphic>
               <a:graphicData uri="http://schemas.openxmlformats.org/drawingml/2006/picture">
                 <pic:pic>
                   <pic:nvPicPr>
-                    <pic:cNvPr descr="data_analysis_2_dark_files/figure-docx/diagnostic%20plots-1.png" id="66" name="Picture"/>
+                    <pic:cNvPr descr="data_analysis_2_files/figure-docx/diagnostic%20plots-1.png" id="55" name="Picture"/>
                     <pic:cNvPicPr>
                       <a:picLocks noChangeArrowheads="1" noChangeAspect="1"/>
                     </pic:cNvPicPr>
                   </pic:nvPicPr>
                   <pic:blipFill>
-                    <a:blip r:embed="rId64"/>
+                    <a:blip r:embed="rId53"/>
                     <a:stretch>
                       <a:fillRect/>
                     </a:stretch>
@@ -7733,18 +8087,18 @@
           <wp:inline>
             <wp:extent cx="4620126" cy="3696101"/>
             <wp:effectExtent b="0" l="0" r="0" t="0"/>
-            <wp:docPr descr="" title="" id="68" name="Picture"/>
+            <wp:docPr descr="" title="" id="57" name="Picture"/>
             <a:graphic>
               <a:graphicData uri="http://schemas.openxmlformats.org/drawingml/2006/picture">
                 <pic:pic>
                   <pic:nvPicPr>
-                    <pic:cNvPr descr="data_analysis_2_dark_files/figure-docx/diagnostic%20plots-2.png" id="69" name="Picture"/>
+                    <pic:cNvPr descr="data_analysis_2_files/figure-docx/diagnostic%20plots-2.png" id="58" name="Picture"/>
                     <pic:cNvPicPr>
                       <a:picLocks noChangeArrowheads="1" noChangeAspect="1"/>
                     </pic:cNvPicPr>
                   </pic:nvPicPr>
                   <pic:blipFill>
-                    <a:blip r:embed="rId67"/>
+                    <a:blip r:embed="rId56"/>
                     <a:stretch>
                       <a:fillRect/>
                     </a:stretch>
@@ -7780,18 +8134,18 @@
           <wp:inline>
             <wp:extent cx="4620126" cy="3696101"/>
             <wp:effectExtent b="0" l="0" r="0" t="0"/>
-            <wp:docPr descr="" title="" id="71" name="Picture"/>
+            <wp:docPr descr="" title="" id="60" name="Picture"/>
             <a:graphic>
               <a:graphicData uri="http://schemas.openxmlformats.org/drawingml/2006/picture">
                 <pic:pic>
                   <pic:nvPicPr>
-                    <pic:cNvPr descr="data_analysis_2_dark_files/figure-docx/diagnostic%20plots-3.png" id="72" name="Picture"/>
+                    <pic:cNvPr descr="data_analysis_2_files/figure-docx/diagnostic%20plots-3.png" id="61" name="Picture"/>
                     <pic:cNvPicPr>
                       <a:picLocks noChangeArrowheads="1" noChangeAspect="1"/>
                     </pic:cNvPicPr>
                   </pic:nvPicPr>
                   <pic:blipFill>
-                    <a:blip r:embed="rId70"/>
+                    <a:blip r:embed="rId59"/>
                     <a:stretch>
                       <a:fillRect/>
                     </a:stretch>
@@ -7827,18 +8181,18 @@
           <wp:inline>
             <wp:extent cx="4620126" cy="3696101"/>
             <wp:effectExtent b="0" l="0" r="0" t="0"/>
-            <wp:docPr descr="" title="" id="74" name="Picture"/>
+            <wp:docPr descr="" title="" id="63" name="Picture"/>
             <a:graphic>
               <a:graphicData uri="http://schemas.openxmlformats.org/drawingml/2006/picture">
                 <pic:pic>
                   <pic:nvPicPr>
-                    <pic:cNvPr descr="data_analysis_2_dark_files/figure-docx/diagnostic%20plots-4.png" id="75" name="Picture"/>
+                    <pic:cNvPr descr="data_analysis_2_files/figure-docx/diagnostic%20plots-4.png" id="64" name="Picture"/>
                     <pic:cNvPicPr>
                       <a:picLocks noChangeArrowheads="1" noChangeAspect="1"/>
                     </pic:cNvPicPr>
                   </pic:nvPicPr>
                   <pic:blipFill>
-                    <a:blip r:embed="rId73"/>
+                    <a:blip r:embed="rId62"/>
                     <a:stretch>
                       <a:fillRect/>
                     </a:stretch>
@@ -7865,8 +8219,8 @@
         </w:drawing>
       </w:r>
     </w:p>
-    <w:bookmarkEnd w:id="76"/>
-    <w:bookmarkStart w:id="78" w:name="glm-and-logistic-regression"/>
+    <w:bookmarkEnd w:id="65"/>
+    <w:bookmarkStart w:id="67" w:name="glm-and-logistic-regression"/>
     <w:p>
       <w:pPr>
         <w:pStyle w:val="Heading2"/>
@@ -7901,7 +8255,7 @@
       <w:r>
         <w:t xml:space="preserve"> </w:t>
       </w:r>
-      <w:hyperlink r:id="rId77">
+      <w:hyperlink r:id="rId66">
         <w:r>
           <w:rPr>
             <w:rStyle w:val="Hyperlink"/>
@@ -8171,25 +8525,25 @@
         <w:rPr>
           <w:rStyle w:val="VerbatimChar"/>
         </w:rPr>
-        <w:t xml:space="preserve">(Intercept)                                 8.427e-01  2.532e+00   0.333</w:t>
-      </w:r>
-      <w:r>
-        <w:br/>
-      </w:r>
-      <w:r>
-        <w:rPr>
-          <w:rStyle w:val="VerbatimChar"/>
-        </w:rPr>
-        <w:t xml:space="preserve">`Fertility rate, total (births per woman)` -8.776e-01  1.011e+00  -0.868</w:t>
-      </w:r>
-      <w:r>
-        <w:br/>
-      </w:r>
-      <w:r>
-        <w:rPr>
-          <w:rStyle w:val="VerbatimChar"/>
-        </w:rPr>
-        <w:t xml:space="preserve">`GDP per capita (constant 2015 US$)`        1.489e-05  3.676e-05   0.405</w:t>
+        <w:t xml:space="preserve">(Intercept)                                 8.480e-01  2.555e+00   0.332</w:t>
+      </w:r>
+      <w:r>
+        <w:br/>
+      </w:r>
+      <w:r>
+        <w:rPr>
+          <w:rStyle w:val="VerbatimChar"/>
+        </w:rPr>
+        <w:t xml:space="preserve">`Fertility rate, total (births per woman)` -8.975e-01  1.042e+00  -0.862</w:t>
+      </w:r>
+      <w:r>
+        <w:br/>
+      </w:r>
+      <w:r>
+        <w:rPr>
+          <w:rStyle w:val="VerbatimChar"/>
+        </w:rPr>
+        <w:t xml:space="preserve">`GDP per capita (constant 2015 US$)`        1.470e-05  3.612e-05   0.407</w:t>
       </w:r>
       <w:r>
         <w:br/>
@@ -8207,25 +8561,25 @@
         <w:rPr>
           <w:rStyle w:val="VerbatimChar"/>
         </w:rPr>
-        <w:t xml:space="preserve">(Intercept)                                   0.739</w:t>
-      </w:r>
-      <w:r>
-        <w:br/>
-      </w:r>
-      <w:r>
-        <w:rPr>
-          <w:rStyle w:val="VerbatimChar"/>
-        </w:rPr>
-        <w:t xml:space="preserve">`Fertility rate, total (births per woman)`    0.385</w:t>
-      </w:r>
-      <w:r>
-        <w:br/>
-      </w:r>
-      <w:r>
-        <w:rPr>
-          <w:rStyle w:val="VerbatimChar"/>
-        </w:rPr>
-        <w:t xml:space="preserve">`GDP per capita (constant 2015 US$)`          0.685</w:t>
+        <w:t xml:space="preserve">(Intercept)                                   0.740</w:t>
+      </w:r>
+      <w:r>
+        <w:br/>
+      </w:r>
+      <w:r>
+        <w:rPr>
+          <w:rStyle w:val="VerbatimChar"/>
+        </w:rPr>
+        <w:t xml:space="preserve">`Fertility rate, total (births per woman)`    0.389</w:t>
+      </w:r>
+      <w:r>
+        <w:br/>
+      </w:r>
+      <w:r>
+        <w:rPr>
+          <w:rStyle w:val="VerbatimChar"/>
+        </w:rPr>
+        <w:t xml:space="preserve">`GDP per capita (constant 2015 US$)`          0.684</w:t>
       </w:r>
       <w:r>
         <w:br/>
@@ -8258,16 +8612,16 @@
         <w:rPr>
           <w:rStyle w:val="VerbatimChar"/>
         </w:rPr>
-        <w:t xml:space="preserve">Residual deviance: 13.306  on  9  degrees of freedom</w:t>
-      </w:r>
-      <w:r>
-        <w:br/>
-      </w:r>
-      <w:r>
-        <w:rPr>
-          <w:rStyle w:val="VerbatimChar"/>
-        </w:rPr>
-        <w:t xml:space="preserve">AIC: 19.306</w:t>
+        <w:t xml:space="preserve">Residual deviance: 13.330  on  9  degrees of freedom</w:t>
+      </w:r>
+      <w:r>
+        <w:br/>
+      </w:r>
+      <w:r>
+        <w:rPr>
+          <w:rStyle w:val="VerbatimChar"/>
+        </w:rPr>
+        <w:t xml:space="preserve">AIC: 19.33</w:t>
       </w:r>
       <w:r>
         <w:br/>
@@ -8290,8 +8644,8 @@
         <w:t xml:space="preserve">We won’t delve further into the interpretation of logistic regression or other regression alternatives here, but just know that nearly anything is possible with R!</w:t>
       </w:r>
     </w:p>
-    <w:bookmarkEnd w:id="78"/>
-    <w:bookmarkStart w:id="83" w:name="python-regression"/>
+    <w:bookmarkEnd w:id="67"/>
+    <w:bookmarkStart w:id="72" w:name="python-regression"/>
     <w:p>
       <w:pPr>
         <w:pStyle w:val="Heading2"/>
@@ -8310,7 +8664,7 @@
       <w:r>
         <w:t xml:space="preserve"> </w:t>
       </w:r>
-      <w:hyperlink r:id="rId79">
+      <w:hyperlink r:id="rId68">
         <w:r>
           <w:rPr>
             <w:rStyle w:val="Hyperlink"/>
@@ -8335,7 +8689,7 @@
       <w:r>
         <w:t xml:space="preserve"> </w:t>
       </w:r>
-      <w:hyperlink r:id="rId80">
+      <w:hyperlink r:id="rId69">
         <w:r>
           <w:rPr>
             <w:rStyle w:val="Hyperlink"/>
@@ -8354,7 +8708,7 @@
       <w:r>
         <w:t xml:space="preserve"> </w:t>
       </w:r>
-      <w:hyperlink r:id="rId81">
+      <w:hyperlink r:id="rId70">
         <w:r>
           <w:rPr>
             <w:rStyle w:val="Hyperlink"/>
@@ -8371,7 +8725,7 @@
       <w:r>
         <w:t xml:space="preserve"> </w:t>
       </w:r>
-      <w:hyperlink r:id="rId82">
+      <w:hyperlink r:id="rId71">
         <w:r>
           <w:rPr>
             <w:rStyle w:val="Hyperlink"/>
@@ -8780,7 +9134,7 @@
         <w:rPr>
           <w:rStyle w:val="VerbatimChar"/>
         </w:rPr>
-        <w:t xml:space="preserve">[-27728.21536913] [[747.3999527]]</w:t>
+        <w:t xml:space="preserve">[-22087.41711684] [[686.50818815]]</w:t>
       </w:r>
     </w:p>
     <w:p>
@@ -8865,12 +9219,12 @@
         <w:rPr>
           <w:rStyle w:val="VerbatimChar"/>
         </w:rPr>
-        <w:t xml:space="preserve">R-squared: 0.33775699752387656</w:t>
-      </w:r>
-    </w:p>
-    <w:bookmarkEnd w:id="83"/>
-    <w:bookmarkEnd w:id="84"/>
-    <w:bookmarkStart w:id="100" w:name="bootstrap"/>
+        <w:t xml:space="preserve">R-squared: 0.364571030386697</w:t>
+      </w:r>
+    </w:p>
+    <w:bookmarkEnd w:id="72"/>
+    <w:bookmarkEnd w:id="73"/>
+    <w:bookmarkStart w:id="89" w:name="bootstrap"/>
     <w:p>
       <w:pPr>
         <w:pStyle w:val="Heading1"/>
@@ -8889,7 +9243,7 @@
       <w:r>
         <w:t xml:space="preserve"> </w:t>
       </w:r>
-      <w:hyperlink r:id="rId85">
+      <w:hyperlink r:id="rId74">
         <w:r>
           <w:rPr>
             <w:rStyle w:val="Hyperlink"/>
@@ -8927,7 +9281,7 @@
       <w:r>
         <w:t xml:space="preserve"> </w:t>
       </w:r>
-      <w:hyperlink r:id="rId86">
+      <w:hyperlink r:id="rId75">
         <w:r>
           <w:rPr>
             <w:rStyle w:val="Hyperlink"/>
@@ -8944,7 +9298,7 @@
       <w:r>
         <w:t xml:space="preserve"> </w:t>
       </w:r>
-      <w:hyperlink r:id="rId87">
+      <w:hyperlink r:id="rId76">
         <w:r>
           <w:rPr>
             <w:rStyle w:val="Hyperlink"/>
@@ -9029,7 +9383,7 @@
       <w:r>
         <w:t xml:space="preserve"> </w:t>
       </w:r>
-      <w:hyperlink r:id="rId88">
+      <w:hyperlink r:id="rId77">
         <w:r>
           <w:rPr>
             <w:rStyle w:val="Hyperlink"/>
@@ -9164,7 +9518,16 @@
         <w:pStyle w:val="BodyText"/>
       </w:pPr>
       <w:r>
-        <w:t xml:space="preserve">Before any sampling we can simply generate the point estimate of our proportion, in this case one of our indicator variables for the gender data, whether a woman can work in dangerous jobs in the same way as a man.</w:t>
+        <w:t xml:space="preserve">Before any sampling we can simply generate the point estimate of our proportion, in this case one of our indicator variables for the gender data, whether the female labor participation rate is</w:t>
+      </w:r>
+      <w:r>
+        <w:t xml:space="preserve"> </w:t>
+      </w:r>
+      <w:r>
+        <w:t xml:space="preserve">“high”</w:t>
+      </w:r>
+      <w:r>
+        <w:t xml:space="preserve">, according to our cutoff.</w:t>
       </w:r>
     </w:p>
     <w:p>
@@ -9286,7 +9649,7 @@
         <w:rPr>
           <w:rStyle w:val="AttributeTok"/>
         </w:rPr>
-        <w:t xml:space="preserve">A woman can work in a job deemed dangerous in the same way as a man (1=yes; 0=no)</w:t>
+        <w:t xml:space="preserve">Fertility rate, total (births per woman)</w:t>
       </w:r>
       <w:r>
         <w:rPr>
@@ -9351,6 +9714,18 @@
         </w:rPr>
         <w:t xml:space="preserve">)</w:t>
       </w:r>
+      <w:r>
+        <w:br/>
+      </w:r>
+      <w:r>
+        <w:br/>
+      </w:r>
+      <w:r>
+        <w:rPr>
+          <w:rStyle w:val="NormalTok"/>
+        </w:rPr>
+        <w:t xml:space="preserve">point_estimate</w:t>
+      </w:r>
     </w:p>
     <w:p>
       <w:pPr>
@@ -9360,7 +9735,51 @@
         <w:rPr>
           <w:rStyle w:val="VerbatimChar"/>
         </w:rPr>
-        <w:t xml:space="preserve">Warning: Removed 1 rows containing missing values.</w:t>
+        <w:t xml:space="preserve">Response: Fertility rate, total (births per woman) (numeric)</w:t>
+      </w:r>
+      <w:r>
+        <w:br/>
+      </w:r>
+      <w:r>
+        <w:rPr>
+          <w:rStyle w:val="VerbatimChar"/>
+        </w:rPr>
+        <w:t xml:space="preserve"># A tibble: 1 × 1</w:t>
+      </w:r>
+      <w:r>
+        <w:br/>
+      </w:r>
+      <w:r>
+        <w:rPr>
+          <w:rStyle w:val="VerbatimChar"/>
+        </w:rPr>
+        <w:t xml:space="preserve">   stat</w:t>
+      </w:r>
+      <w:r>
+        <w:br/>
+      </w:r>
+      <w:r>
+        <w:rPr>
+          <w:rStyle w:val="VerbatimChar"/>
+        </w:rPr>
+        <w:t xml:space="preserve">  &lt;dbl&gt;</w:t>
+      </w:r>
+      <w:r>
+        <w:br/>
+      </w:r>
+      <w:r>
+        <w:rPr>
+          <w:rStyle w:val="VerbatimChar"/>
+        </w:rPr>
+        <w:t xml:space="preserve">1  2.15</w:t>
+      </w:r>
+    </w:p>
+    <w:p>
+      <w:pPr>
+        <w:pStyle w:val="FirstParagraph"/>
+      </w:pPr>
+      <w:r>
+        <w:t xml:space="preserve">Then run replicate samples that we will use to estimate the confidence interval.</w:t>
       </w:r>
     </w:p>
     <w:p>
@@ -9371,72 +9790,6 @@
         <w:rPr>
           <w:rStyle w:val="NormalTok"/>
         </w:rPr>
-        <w:t xml:space="preserve">point_estimate</w:t>
-      </w:r>
-    </w:p>
-    <w:p>
-      <w:pPr>
-        <w:pStyle w:val="SourceCode"/>
-      </w:pPr>
-      <w:r>
-        <w:rPr>
-          <w:rStyle w:val="VerbatimChar"/>
-        </w:rPr>
-        <w:t xml:space="preserve">Response: A woman can work in a job deemed dangerous in the same way as a man...</w:t>
-      </w:r>
-      <w:r>
-        <w:br/>
-      </w:r>
-      <w:r>
-        <w:rPr>
-          <w:rStyle w:val="VerbatimChar"/>
-        </w:rPr>
-        <w:t xml:space="preserve"># A tibble: 1 × 1</w:t>
-      </w:r>
-      <w:r>
-        <w:br/>
-      </w:r>
-      <w:r>
-        <w:rPr>
-          <w:rStyle w:val="VerbatimChar"/>
-        </w:rPr>
-        <w:t xml:space="preserve">   stat</w:t>
-      </w:r>
-      <w:r>
-        <w:br/>
-      </w:r>
-      <w:r>
-        <w:rPr>
-          <w:rStyle w:val="VerbatimChar"/>
-        </w:rPr>
-        <w:t xml:space="preserve">  &lt;dbl&gt;</w:t>
-      </w:r>
-      <w:r>
-        <w:br/>
-      </w:r>
-      <w:r>
-        <w:rPr>
-          <w:rStyle w:val="VerbatimChar"/>
-        </w:rPr>
-        <w:t xml:space="preserve">1 0.545</w:t>
-      </w:r>
-    </w:p>
-    <w:p>
-      <w:pPr>
-        <w:pStyle w:val="FirstParagraph"/>
-      </w:pPr>
-      <w:r>
-        <w:t xml:space="preserve">Then run replicate samples that we will use to estimate the confidence interval.</w:t>
-      </w:r>
-    </w:p>
-    <w:p>
-      <w:pPr>
-        <w:pStyle w:val="SourceCode"/>
-      </w:pPr>
-      <w:r>
-        <w:rPr>
-          <w:rStyle w:val="NormalTok"/>
-        </w:rPr>
         <w:t xml:space="preserve">boot_dist_dangerous </w:t>
       </w:r>
       <w:r>
@@ -9500,7 +9853,7 @@
         <w:rPr>
           <w:rStyle w:val="AttributeTok"/>
         </w:rPr>
-        <w:t xml:space="preserve">A woman can work in a job deemed dangerous in the same way as a man (1=yes; 0=no)</w:t>
+        <w:t xml:space="preserve">Fertility rate, total (births per woman)</w:t>
       </w:r>
       <w:r>
         <w:rPr>
@@ -9639,17 +9992,6 @@
           <w:rStyle w:val="NormalTok"/>
         </w:rPr>
         <w:t xml:space="preserve">)</w:t>
-      </w:r>
-    </w:p>
-    <w:p>
-      <w:pPr>
-        <w:pStyle w:val="SourceCode"/>
-      </w:pPr>
-      <w:r>
-        <w:rPr>
-          <w:rStyle w:val="VerbatimChar"/>
-        </w:rPr>
-        <w:t xml:space="preserve">Warning: Removed 1 rows containing missing values.</w:t>
       </w:r>
     </w:p>
     <w:p>
@@ -9707,18 +10049,18 @@
           <wp:inline>
             <wp:extent cx="4620126" cy="3696101"/>
             <wp:effectExtent b="0" l="0" r="0" t="0"/>
-            <wp:docPr descr="" title="" id="90" name="Picture"/>
+            <wp:docPr descr="" title="" id="79" name="Picture"/>
             <a:graphic>
               <a:graphicData uri="http://schemas.openxmlformats.org/drawingml/2006/picture">
                 <pic:pic>
                   <pic:nvPicPr>
-                    <pic:cNvPr descr="data_analysis_2_dark_files/figure-docx/bootstrap%20replicates-1.png" id="91" name="Picture"/>
+                    <pic:cNvPr descr="data_analysis_2_files/figure-docx/bootstrap%20replicates-1.png" id="80" name="Picture"/>
                     <pic:cNvPicPr>
                       <a:picLocks noChangeArrowheads="1" noChangeAspect="1"/>
                     </pic:cNvPicPr>
                   </pic:nvPicPr>
                   <pic:blipFill>
-                    <a:blip r:embed="rId89"/>
+                    <a:blip r:embed="rId78"/>
                     <a:stretch>
                       <a:fillRect/>
                     </a:stretch>
@@ -9855,18 +10197,18 @@
           <wp:inline>
             <wp:extent cx="4620126" cy="3696101"/>
             <wp:effectExtent b="0" l="0" r="0" t="0"/>
-            <wp:docPr descr="" title="" id="93" name="Picture"/>
+            <wp:docPr descr="" title="" id="82" name="Picture"/>
             <a:graphic>
               <a:graphicData uri="http://schemas.openxmlformats.org/drawingml/2006/picture">
                 <pic:pic>
                   <pic:nvPicPr>
-                    <pic:cNvPr descr="data_analysis_2_dark_files/figure-docx/bootstrap%20replicates-2.png" id="94" name="Picture"/>
+                    <pic:cNvPr descr="data_analysis_2_files/figure-docx/bootstrap%20replicates-2.png" id="83" name="Picture"/>
                     <pic:cNvPicPr>
                       <a:picLocks noChangeArrowheads="1" noChangeAspect="1"/>
                     </pic:cNvPicPr>
                   </pic:nvPicPr>
                   <pic:blipFill>
-                    <a:blip r:embed="rId92"/>
+                    <a:blip r:embed="rId81"/>
                     <a:stretch>
                       <a:fillRect/>
                     </a:stretch>
@@ -10056,7 +10398,7 @@
         <w:rPr>
           <w:rStyle w:val="VerbatimChar"/>
         </w:rPr>
-        <w:t xml:space="preserve">1    0.251    0.840</w:t>
+        <w:t xml:space="preserve">1     1.70     2.60</w:t>
       </w:r>
     </w:p>
     <w:p>
@@ -10086,7 +10428,7 @@
         <w:t xml:space="preserve">“bootstrapping is best suited for modeling studies where the data have been generated through random sampling from a population.”</w:t>
       </w:r>
     </w:p>
-    <w:bookmarkStart w:id="95" w:name="t-test-via-simulation"/>
+    <w:bookmarkStart w:id="84" w:name="t-test-via-simulation"/>
     <w:p>
       <w:pPr>
         <w:pStyle w:val="Heading2"/>
@@ -10234,16 +10576,16 @@
         <w:rPr>
           <w:rStyle w:val="VerbatimChar"/>
         </w:rPr>
-        <w:t xml:space="preserve"> [1]  9.865  7.854 47.096 11.856  6.267 25.371 14.414  8.813 19.792 -3.810</w:t>
-      </w:r>
-      <w:r>
-        <w:br/>
-      </w:r>
-      <w:r>
-        <w:rPr>
-          <w:rStyle w:val="VerbatimChar"/>
-        </w:rPr>
-        <w:t xml:space="preserve">[11]  9.482 33.853</w:t>
+        <w:t xml:space="preserve"> [1]  8.783  7.951 46.683 10.973  7.599 27.071 15.786  8.876 35.302  6.921</w:t>
+      </w:r>
+      <w:r>
+        <w:br/>
+      </w:r>
+      <w:r>
+        <w:rPr>
+          <w:rStyle w:val="VerbatimChar"/>
+        </w:rPr>
+        <w:t xml:space="preserve">[11]  9.315 33.918</w:t>
       </w:r>
     </w:p>
     <w:p>
@@ -10364,7 +10706,7 @@
         <w:rPr>
           <w:rStyle w:val="VerbatimChar"/>
         </w:rPr>
-        <w:t xml:space="preserve">  8.855785 30.163030</w:t>
+        <w:t xml:space="preserve"> 10.76685 32.55667</w:t>
       </w:r>
       <w:r>
         <w:br/>
@@ -10391,11 +10733,11 @@
         <w:rPr>
           <w:rStyle w:val="VerbatimChar"/>
         </w:rPr>
-        <w:t xml:space="preserve"> 15.90442 </w:t>
-      </w:r>
-    </w:p>
-    <w:bookmarkEnd w:id="95"/>
-    <w:bookmarkStart w:id="96" w:name="X0a7fd2289b70914eb90e959edbe3f8ae5981d5a"/>
+        <w:t xml:space="preserve"> 18.26483 </w:t>
+      </w:r>
+    </w:p>
+    <w:bookmarkEnd w:id="84"/>
+    <w:bookmarkStart w:id="85" w:name="X0a7fd2289b70914eb90e959edbe3f8ae5981d5a"/>
     <w:p>
       <w:pPr>
         <w:pStyle w:val="Heading2"/>
@@ -10967,11 +11309,11 @@
         <w:rPr>
           <w:rStyle w:val="VerbatimChar"/>
         </w:rPr>
-        <w:t xml:space="preserve">1    -0.480         5.49</w:t>
-      </w:r>
-    </w:p>
-    <w:bookmarkEnd w:id="96"/>
-    <w:bookmarkStart w:id="99" w:name="python-bookstrap"/>
+        <w:t xml:space="preserve">1    -0.197         6.69</w:t>
+      </w:r>
+    </w:p>
+    <w:bookmarkEnd w:id="85"/>
+    <w:bookmarkStart w:id="88" w:name="python-bookstrap"/>
     <w:p>
       <w:pPr>
         <w:pStyle w:val="Heading2"/>
@@ -10990,7 +11332,7 @@
       <w:r>
         <w:t xml:space="preserve"> </w:t>
       </w:r>
-      <w:hyperlink r:id="rId97">
+      <w:hyperlink r:id="rId86">
         <w:r>
           <w:rPr>
             <w:rStyle w:val="Hyperlink"/>
@@ -11246,7 +11588,7 @@
         <w:rPr>
           <w:rStyle w:val="VerbatimChar"/>
         </w:rPr>
-        <w:t xml:space="preserve">ConfidenceInterval(low=np.float64(8.982916666666675), high=np.float64(23.89338749999999))</w:t>
+        <w:t xml:space="preserve">ConfidenceInterval(low=np.float64(11.354791666666667), high=np.float64(26.21634583333334))</w:t>
       </w:r>
     </w:p>
     <w:p>
@@ -11259,7 +11601,7 @@
       <w:r>
         <w:t xml:space="preserve"> </w:t>
       </w:r>
-      <w:hyperlink r:id="rId98">
+      <w:hyperlink r:id="rId87">
         <w:r>
           <w:rPr>
             <w:rStyle w:val="Hyperlink"/>
@@ -11296,8 +11638,8 @@
         <w:t xml:space="preserve">(and Python!)</w:t>
       </w:r>
     </w:p>
-    <w:bookmarkEnd w:id="99"/>
-    <w:bookmarkEnd w:id="100"/>
+    <w:bookmarkEnd w:id="88"/>
+    <w:bookmarkEnd w:id="89"/>
     <w:sectPr>
       <w:footnotePr>
         <w:numRestart w:val="eachSect"/>
@@ -11525,10 +11867,10 @@
   <w:docDefaults>
     <w:rPrDefault>
       <w:rPr>
-        <w:rFonts w:asciiTheme="minorHAnsi" w:cstheme="minorBidi" w:eastAsiaTheme="minorHAnsi" w:hAnsiTheme="minorHAnsi"/>
+        <w:rFonts w:asciiTheme="minorHAnsi" w:cstheme="minorBidi" w:eastAsiaTheme="minorEastAsia" w:hAnsiTheme="minorHAnsi"/>
         <w:sz w:val="24"/>
         <w:szCs w:val="24"/>
-        <w:lang w:bidi="ar-SA" w:eastAsia="en-US" w:val="en-US"/>
+        <w:lang w:bidi="ar-SA" w:eastAsia="zh-CN" w:val="en-US"/>
       </w:rPr>
     </w:rPrDefault>
     <w:pPrDefault>
@@ -12069,13 +12411,6 @@
       </w:tblCellMar>
     </w:tblPr>
     <w:tblStylePr w:type="firstRow">
-      <w:tblPr>
-        <w:jc w:val="left"/>
-        <w:tblInd w:type="dxa" w:w="0"/>
-      </w:tblPr>
-      <w:trPr>
-        <w:jc w:val="left"/>
-      </w:trPr>
       <w:tcPr>
         <w:tcBorders>
           <w:bottom w:val="single"/>

</xml_diff>